<commit_message>
Dựng nội dung cho thuyết trình về Figma
</commit_message>
<xml_diff>
--- a/Documents/Note.docx
+++ b/Documents/Note.docx
@@ -3,14 +3,53 @@
 <w:document xmlns:wpc="http://schemas.microsoft.com/office/word/2010/wordprocessingCanvas" xmlns:cx="http://schemas.microsoft.com/office/drawing/2014/chartex" xmlns:cx1="http://schemas.microsoft.com/office/drawing/2015/9/8/chartex" xmlns:cx2="http://schemas.microsoft.com/office/drawing/2015/10/21/chartex" xmlns:cx3="http://schemas.microsoft.com/office/drawing/2016/5/9/chartex" xmlns:cx4="http://schemas.microsoft.com/office/drawing/2016/5/10/chartex" xmlns:cx5="http://schemas.microsoft.com/office/drawing/2016/5/11/chartex" xmlns:cx6="http://schemas.microsoft.com/office/drawing/2016/5/12/chartex" xmlns:cx7="http://schemas.microsoft.com/office/drawing/2016/5/13/chartex" xmlns:cx8="http://schemas.microsoft.com/office/drawing/2016/5/14/chartex" xmlns:mc="http://schemas.openxmlformats.org/markup-compatibility/2006" xmlns:aink="http://schemas.microsoft.com/office/drawing/2016/ink" xmlns:am3d="http://schemas.microsoft.com/office/drawing/2017/model3d" xmlns:o="urn:schemas-microsoft-com:office:office" xmlns:oel="http://schemas.microsoft.com/office/2019/extlst" xmlns:r="http://schemas.openxmlformats.org/officeDocument/2006/relationships" xmlns:m="http://schemas.openxmlformats.org/officeDocument/2006/math" xmlns:v="urn:schemas-microsoft-com:vml" xmlns:wp14="http://schemas.microsoft.com/office/word/2010/wordprocessingDrawing" xmlns:wp="http://schemas.openxmlformats.org/drawingml/2006/wordprocessingDrawing" xmlns:w10="urn:schemas-microsoft-com:office:word" xmlns:w="http://schemas.openxmlformats.org/wordprocessingml/2006/main" xmlns:w14="http://schemas.microsoft.com/office/word/2010/wordml" xmlns:w15="http://schemas.microsoft.com/office/word/2012/wordml" xmlns:w16cex="http://schemas.microsoft.com/office/word/2018/wordml/cex" xmlns:w16cid="http://schemas.microsoft.com/office/word/2016/wordml/cid" xmlns:w16="http://schemas.microsoft.com/office/word/2018/wordml" xmlns:w16du="http://schemas.microsoft.com/office/word/2023/wordml/word16du" xmlns:w16sdtdh="http://schemas.microsoft.com/office/word/2020/wordml/sdtdatahash" xmlns:w16sdtfl="http://schemas.microsoft.com/office/word/2024/wordml/sdtformatlock" xmlns:w16se="http://schemas.microsoft.com/office/word/2015/wordml/symex" xmlns:wpg="http://schemas.microsoft.com/office/word/2010/wordprocessingGroup" xmlns:wpi="http://schemas.microsoft.com/office/word/2010/wordprocessingInk" xmlns:wne="http://schemas.microsoft.com/office/word/2006/wordml" xmlns:wps="http://schemas.microsoft.com/office/word/2010/wordprocessingShape" mc:Ignorable="w14 w15 w16se w16cid w16 w16cex w16sdtdh w16sdtfl w16du wp14">
   <w:body>
     <w:p>
-      <w:r>
-        <w:t>Phần mềm chấm công</w:t>
-      </w:r>
+      <w:proofErr w:type="spellStart"/>
+      <w:r>
+        <w:t>Phần</w:t>
+      </w:r>
+      <w:proofErr w:type="spellEnd"/>
+      <w:r>
+        <w:t xml:space="preserve"> </w:t>
+      </w:r>
+      <w:proofErr w:type="spellStart"/>
+      <w:r>
+        <w:t>mềm</w:t>
+      </w:r>
+      <w:proofErr w:type="spellEnd"/>
+      <w:r>
+        <w:t xml:space="preserve"> </w:t>
+      </w:r>
+      <w:proofErr w:type="spellStart"/>
+      <w:r>
+        <w:t>chấm</w:t>
+      </w:r>
+      <w:proofErr w:type="spellEnd"/>
+      <w:r>
+        <w:t xml:space="preserve"> </w:t>
+      </w:r>
+      <w:proofErr w:type="spellStart"/>
+      <w:r>
+        <w:t>công</w:t>
+      </w:r>
+      <w:proofErr w:type="spellEnd"/>
     </w:p>
     <w:p/>
     <w:p>
-      <w:r>
-        <w:t xml:space="preserve">Khái quát: </w:t>
+      <w:proofErr w:type="spellStart"/>
+      <w:r>
+        <w:t>Khái</w:t>
+      </w:r>
+      <w:proofErr w:type="spellEnd"/>
+      <w:r>
+        <w:t xml:space="preserve"> </w:t>
+      </w:r>
+      <w:proofErr w:type="spellStart"/>
+      <w:r>
+        <w:t>quát</w:t>
+      </w:r>
+      <w:proofErr w:type="spellEnd"/>
+      <w:r>
+        <w:t xml:space="preserve">: </w:t>
       </w:r>
     </w:p>
     <w:p>
@@ -21,23 +60,194 @@
           <w:numId w:val="1"/>
         </w:numPr>
       </w:pPr>
-      <w:r>
-        <w:t xml:space="preserve">Ghi nhận giờ </w:t>
-      </w:r>
-      <w:r>
-        <w:t>đi làm của nhân viên</w:t>
-      </w:r>
+      <w:proofErr w:type="spellStart"/>
+      <w:r>
+        <w:t>Ghi</w:t>
+      </w:r>
+      <w:proofErr w:type="spellEnd"/>
+      <w:r>
+        <w:t xml:space="preserve"> </w:t>
+      </w:r>
+      <w:proofErr w:type="spellStart"/>
+      <w:r>
+        <w:t>nhận</w:t>
+      </w:r>
+      <w:proofErr w:type="spellEnd"/>
+      <w:r>
+        <w:t xml:space="preserve"> </w:t>
+      </w:r>
+      <w:proofErr w:type="spellStart"/>
+      <w:r>
+        <w:t>giờ</w:t>
+      </w:r>
+      <w:proofErr w:type="spellEnd"/>
+      <w:r>
+        <w:t xml:space="preserve"> </w:t>
+      </w:r>
+      <w:proofErr w:type="spellStart"/>
+      <w:r>
+        <w:t>đi</w:t>
+      </w:r>
+      <w:proofErr w:type="spellEnd"/>
+      <w:r>
+        <w:t xml:space="preserve"> </w:t>
+      </w:r>
+      <w:proofErr w:type="spellStart"/>
+      <w:r>
+        <w:t>làm</w:t>
+      </w:r>
+      <w:proofErr w:type="spellEnd"/>
+      <w:r>
+        <w:t xml:space="preserve"> </w:t>
+      </w:r>
+      <w:proofErr w:type="spellStart"/>
+      <w:r>
+        <w:t>của</w:t>
+      </w:r>
+      <w:proofErr w:type="spellEnd"/>
+      <w:r>
+        <w:t xml:space="preserve"> </w:t>
+      </w:r>
+      <w:proofErr w:type="spellStart"/>
+      <w:r>
+        <w:t>nhân</w:t>
+      </w:r>
+      <w:proofErr w:type="spellEnd"/>
+      <w:r>
+        <w:t xml:space="preserve"> </w:t>
+      </w:r>
+      <w:proofErr w:type="spellStart"/>
+      <w:r>
+        <w:t>viên</w:t>
+      </w:r>
+      <w:proofErr w:type="spellEnd"/>
     </w:p>
     <w:p/>
     <w:p>
-      <w:r>
-        <w:t>Cụ thể</w:t>
-      </w:r>
+      <w:proofErr w:type="spellStart"/>
+      <w:r>
+        <w:t>Cụ</w:t>
+      </w:r>
+      <w:proofErr w:type="spellEnd"/>
+      <w:r>
+        <w:t xml:space="preserve"> </w:t>
+      </w:r>
+      <w:proofErr w:type="spellStart"/>
+      <w:r>
+        <w:t>thể</w:t>
+      </w:r>
+      <w:proofErr w:type="spellEnd"/>
     </w:p>
     <w:p>
-      <w:r>
-        <w:t>Chấm công bằng thẻ, bằng vân tay, khuôn mặt. chấm công để tính lương</w:t>
-      </w:r>
+      <w:proofErr w:type="spellStart"/>
+      <w:r>
+        <w:t>Chấm</w:t>
+      </w:r>
+      <w:proofErr w:type="spellEnd"/>
+      <w:r>
+        <w:t xml:space="preserve"> </w:t>
+      </w:r>
+      <w:proofErr w:type="spellStart"/>
+      <w:r>
+        <w:t>công</w:t>
+      </w:r>
+      <w:proofErr w:type="spellEnd"/>
+      <w:r>
+        <w:t xml:space="preserve"> </w:t>
+      </w:r>
+      <w:proofErr w:type="spellStart"/>
+      <w:r>
+        <w:t>bằng</w:t>
+      </w:r>
+      <w:proofErr w:type="spellEnd"/>
+      <w:r>
+        <w:t xml:space="preserve"> </w:t>
+      </w:r>
+      <w:proofErr w:type="spellStart"/>
+      <w:r>
+        <w:t>thẻ</w:t>
+      </w:r>
+      <w:proofErr w:type="spellEnd"/>
+      <w:r>
+        <w:t xml:space="preserve">, </w:t>
+      </w:r>
+      <w:proofErr w:type="spellStart"/>
+      <w:r>
+        <w:t>bằng</w:t>
+      </w:r>
+      <w:proofErr w:type="spellEnd"/>
+      <w:r>
+        <w:t xml:space="preserve"> </w:t>
+      </w:r>
+      <w:proofErr w:type="spellStart"/>
+      <w:r>
+        <w:t>vân</w:t>
+      </w:r>
+      <w:proofErr w:type="spellEnd"/>
+      <w:r>
+        <w:t xml:space="preserve"> </w:t>
+      </w:r>
+      <w:proofErr w:type="spellStart"/>
+      <w:r>
+        <w:t>tay</w:t>
+      </w:r>
+      <w:proofErr w:type="spellEnd"/>
+      <w:r>
+        <w:t xml:space="preserve">, </w:t>
+      </w:r>
+      <w:proofErr w:type="spellStart"/>
+      <w:r>
+        <w:t>khuôn</w:t>
+      </w:r>
+      <w:proofErr w:type="spellEnd"/>
+      <w:r>
+        <w:t xml:space="preserve"> </w:t>
+      </w:r>
+      <w:proofErr w:type="spellStart"/>
+      <w:r>
+        <w:t>mặt</w:t>
+      </w:r>
+      <w:proofErr w:type="spellEnd"/>
+      <w:r>
+        <w:t xml:space="preserve">. </w:t>
+      </w:r>
+      <w:proofErr w:type="spellStart"/>
+      <w:r>
+        <w:t>chấm</w:t>
+      </w:r>
+      <w:proofErr w:type="spellEnd"/>
+      <w:r>
+        <w:t xml:space="preserve"> </w:t>
+      </w:r>
+      <w:proofErr w:type="spellStart"/>
+      <w:r>
+        <w:t>công</w:t>
+      </w:r>
+      <w:proofErr w:type="spellEnd"/>
+      <w:r>
+        <w:t xml:space="preserve"> </w:t>
+      </w:r>
+      <w:proofErr w:type="spellStart"/>
+      <w:r>
+        <w:t>để</w:t>
+      </w:r>
+      <w:proofErr w:type="spellEnd"/>
+      <w:r>
+        <w:t xml:space="preserve"> </w:t>
+      </w:r>
+      <w:proofErr w:type="spellStart"/>
+      <w:r>
+        <w:t>tính</w:t>
+      </w:r>
+      <w:proofErr w:type="spellEnd"/>
+      <w:r>
+        <w:t xml:space="preserve"> </w:t>
+      </w:r>
+      <w:proofErr w:type="spellStart"/>
+      <w:r>
+        <w:t>lương</w:t>
+      </w:r>
+      <w:proofErr w:type="spellEnd"/>
     </w:p>
     <w:p>
       <w:pPr>
@@ -48,8 +258,29 @@
         </w:numPr>
       </w:pPr>
       <w:r>
-        <w:t>Quản lý nhân viên</w:t>
-      </w:r>
+        <w:t xml:space="preserve">Quản </w:t>
+      </w:r>
+      <w:proofErr w:type="spellStart"/>
+      <w:r>
+        <w:t>lý</w:t>
+      </w:r>
+      <w:proofErr w:type="spellEnd"/>
+      <w:r>
+        <w:t xml:space="preserve"> </w:t>
+      </w:r>
+      <w:proofErr w:type="spellStart"/>
+      <w:r>
+        <w:t>nhân</w:t>
+      </w:r>
+      <w:proofErr w:type="spellEnd"/>
+      <w:r>
+        <w:t xml:space="preserve"> </w:t>
+      </w:r>
+      <w:proofErr w:type="spellStart"/>
+      <w:r>
+        <w:t>viên</w:t>
+      </w:r>
+      <w:proofErr w:type="spellEnd"/>
     </w:p>
     <w:p>
       <w:pPr>
@@ -59,8 +290,13 @@
           <w:numId w:val="3"/>
         </w:numPr>
       </w:pPr>
-      <w:r>
-        <w:t xml:space="preserve">Thêm </w:t>
+      <w:proofErr w:type="spellStart"/>
+      <w:r>
+        <w:t>Thêm</w:t>
+      </w:r>
+      <w:proofErr w:type="spellEnd"/>
+      <w:r>
+        <w:t xml:space="preserve"> </w:t>
       </w:r>
     </w:p>
     <w:p>
@@ -71,9 +307,11 @@
           <w:numId w:val="3"/>
         </w:numPr>
       </w:pPr>
+      <w:proofErr w:type="spellStart"/>
       <w:r>
         <w:t>Sửa</w:t>
       </w:r>
+      <w:proofErr w:type="spellEnd"/>
     </w:p>
     <w:p>
       <w:pPr>
@@ -83,9 +321,11 @@
           <w:numId w:val="3"/>
         </w:numPr>
       </w:pPr>
+      <w:proofErr w:type="spellStart"/>
       <w:r>
         <w:t>Xoá</w:t>
       </w:r>
+      <w:proofErr w:type="spellEnd"/>
     </w:p>
     <w:p>
       <w:pPr>
@@ -95,9 +335,19 @@
           <w:numId w:val="2"/>
         </w:numPr>
       </w:pPr>
-      <w:r>
-        <w:t>Chấm công</w:t>
-      </w:r>
+      <w:proofErr w:type="spellStart"/>
+      <w:r>
+        <w:t>Chấm</w:t>
+      </w:r>
+      <w:proofErr w:type="spellEnd"/>
+      <w:r>
+        <w:t xml:space="preserve"> </w:t>
+      </w:r>
+      <w:proofErr w:type="spellStart"/>
+      <w:r>
+        <w:t>công</w:t>
+      </w:r>
+      <w:proofErr w:type="spellEnd"/>
     </w:p>
     <w:p>
       <w:pPr>
@@ -132,8 +382,29 @@
         </w:numPr>
       </w:pPr>
       <w:r>
-        <w:t>Quản lý ca làm việc</w:t>
-      </w:r>
+        <w:t xml:space="preserve">Quản </w:t>
+      </w:r>
+      <w:proofErr w:type="spellStart"/>
+      <w:r>
+        <w:t>lý</w:t>
+      </w:r>
+      <w:proofErr w:type="spellEnd"/>
+      <w:r>
+        <w:t xml:space="preserve"> ca </w:t>
+      </w:r>
+      <w:proofErr w:type="spellStart"/>
+      <w:r>
+        <w:t>làm</w:t>
+      </w:r>
+      <w:proofErr w:type="spellEnd"/>
+      <w:r>
+        <w:t xml:space="preserve"> </w:t>
+      </w:r>
+      <w:proofErr w:type="spellStart"/>
+      <w:r>
+        <w:t>việc</w:t>
+      </w:r>
+      <w:proofErr w:type="spellEnd"/>
     </w:p>
     <w:p>
       <w:pPr>
@@ -143,9 +414,19 @@
           <w:numId w:val="3"/>
         </w:numPr>
       </w:pPr>
-      <w:r>
-        <w:t>Tạo ca làm</w:t>
-      </w:r>
+      <w:proofErr w:type="spellStart"/>
+      <w:r>
+        <w:t>Tạo</w:t>
+      </w:r>
+      <w:proofErr w:type="spellEnd"/>
+      <w:r>
+        <w:t xml:space="preserve"> ca </w:t>
+      </w:r>
+      <w:proofErr w:type="spellStart"/>
+      <w:r>
+        <w:t>làm</w:t>
+      </w:r>
+      <w:proofErr w:type="spellEnd"/>
     </w:p>
     <w:p>
       <w:pPr>
@@ -155,9 +436,51 @@
           <w:numId w:val="3"/>
         </w:numPr>
       </w:pPr>
-      <w:r>
-        <w:t>Gán ca làm việc cho nhân viên</w:t>
-      </w:r>
+      <w:proofErr w:type="spellStart"/>
+      <w:r>
+        <w:t>Gán</w:t>
+      </w:r>
+      <w:proofErr w:type="spellEnd"/>
+      <w:r>
+        <w:t xml:space="preserve"> ca </w:t>
+      </w:r>
+      <w:proofErr w:type="spellStart"/>
+      <w:r>
+        <w:t>làm</w:t>
+      </w:r>
+      <w:proofErr w:type="spellEnd"/>
+      <w:r>
+        <w:t xml:space="preserve"> </w:t>
+      </w:r>
+      <w:proofErr w:type="spellStart"/>
+      <w:r>
+        <w:t>việc</w:t>
+      </w:r>
+      <w:proofErr w:type="spellEnd"/>
+      <w:r>
+        <w:t xml:space="preserve"> </w:t>
+      </w:r>
+      <w:proofErr w:type="spellStart"/>
+      <w:r>
+        <w:t>cho</w:t>
+      </w:r>
+      <w:proofErr w:type="spellEnd"/>
+      <w:r>
+        <w:t xml:space="preserve"> </w:t>
+      </w:r>
+      <w:proofErr w:type="spellStart"/>
+      <w:r>
+        <w:t>nhân</w:t>
+      </w:r>
+      <w:proofErr w:type="spellEnd"/>
+      <w:r>
+        <w:t xml:space="preserve"> </w:t>
+      </w:r>
+      <w:proofErr w:type="spellStart"/>
+      <w:r>
+        <w:t>viên</w:t>
+      </w:r>
+      <w:proofErr w:type="spellEnd"/>
     </w:p>
     <w:p>
       <w:pPr>
@@ -167,9 +490,35 @@
           <w:numId w:val="2"/>
         </w:numPr>
       </w:pPr>
-      <w:r>
-        <w:t>Tính công, tính lương</w:t>
-      </w:r>
+      <w:proofErr w:type="spellStart"/>
+      <w:r>
+        <w:t>Tính</w:t>
+      </w:r>
+      <w:proofErr w:type="spellEnd"/>
+      <w:r>
+        <w:t xml:space="preserve"> </w:t>
+      </w:r>
+      <w:proofErr w:type="spellStart"/>
+      <w:r>
+        <w:t>công</w:t>
+      </w:r>
+      <w:proofErr w:type="spellEnd"/>
+      <w:r>
+        <w:t xml:space="preserve">, </w:t>
+      </w:r>
+      <w:proofErr w:type="spellStart"/>
+      <w:r>
+        <w:t>tính</w:t>
+      </w:r>
+      <w:proofErr w:type="spellEnd"/>
+      <w:r>
+        <w:t xml:space="preserve"> </w:t>
+      </w:r>
+      <w:proofErr w:type="spellStart"/>
+      <w:r>
+        <w:t>lương</w:t>
+      </w:r>
+      <w:proofErr w:type="spellEnd"/>
     </w:p>
     <w:p>
       <w:pPr>
@@ -179,9 +528,35 @@
           <w:numId w:val="3"/>
         </w:numPr>
       </w:pPr>
-      <w:r>
-        <w:t>Tính lương cơ bản</w:t>
-      </w:r>
+      <w:proofErr w:type="spellStart"/>
+      <w:r>
+        <w:t>Tính</w:t>
+      </w:r>
+      <w:proofErr w:type="spellEnd"/>
+      <w:r>
+        <w:t xml:space="preserve"> </w:t>
+      </w:r>
+      <w:proofErr w:type="spellStart"/>
+      <w:r>
+        <w:t>lương</w:t>
+      </w:r>
+      <w:proofErr w:type="spellEnd"/>
+      <w:r>
+        <w:t xml:space="preserve"> </w:t>
+      </w:r>
+      <w:proofErr w:type="spellStart"/>
+      <w:r>
+        <w:t>cơ</w:t>
+      </w:r>
+      <w:proofErr w:type="spellEnd"/>
+      <w:r>
+        <w:t xml:space="preserve"> </w:t>
+      </w:r>
+      <w:proofErr w:type="spellStart"/>
+      <w:r>
+        <w:t>bản</w:t>
+      </w:r>
+      <w:proofErr w:type="spellEnd"/>
     </w:p>
     <w:p>
       <w:pPr>
@@ -191,8 +566,13 @@
           <w:numId w:val="3"/>
         </w:numPr>
       </w:pPr>
-      <w:r>
-        <w:t xml:space="preserve">Thưởng </w:t>
+      <w:proofErr w:type="spellStart"/>
+      <w:r>
+        <w:t>Thưởng</w:t>
+      </w:r>
+      <w:proofErr w:type="spellEnd"/>
+      <w:r>
+        <w:t xml:space="preserve"> </w:t>
       </w:r>
     </w:p>
     <w:p>
@@ -203,9 +583,19 @@
           <w:numId w:val="3"/>
         </w:numPr>
       </w:pPr>
-      <w:r>
-        <w:t>Phụ cấp</w:t>
-      </w:r>
+      <w:proofErr w:type="spellStart"/>
+      <w:r>
+        <w:t>Phụ</w:t>
+      </w:r>
+      <w:proofErr w:type="spellEnd"/>
+      <w:r>
+        <w:t xml:space="preserve"> </w:t>
+      </w:r>
+      <w:proofErr w:type="spellStart"/>
+      <w:r>
+        <w:t>cấp</w:t>
+      </w:r>
+      <w:proofErr w:type="spellEnd"/>
     </w:p>
     <w:p>
       <w:pPr>
@@ -215,9 +605,27 @@
           <w:numId w:val="3"/>
         </w:numPr>
       </w:pPr>
-      <w:r>
-        <w:t>Đóng bảo hiểm</w:t>
-      </w:r>
+      <w:proofErr w:type="spellStart"/>
+      <w:r>
+        <w:t>Đóng</w:t>
+      </w:r>
+      <w:proofErr w:type="spellEnd"/>
+      <w:r>
+        <w:t xml:space="preserve"> </w:t>
+      </w:r>
+      <w:proofErr w:type="spellStart"/>
+      <w:r>
+        <w:t>bảo</w:t>
+      </w:r>
+      <w:proofErr w:type="spellEnd"/>
+      <w:r>
+        <w:t xml:space="preserve"> </w:t>
+      </w:r>
+      <w:proofErr w:type="spellStart"/>
+      <w:r>
+        <w:t>hiểm</w:t>
+      </w:r>
+      <w:proofErr w:type="spellEnd"/>
     </w:p>
     <w:p>
       <w:pPr>
@@ -228,8 +636,29 @@
         </w:numPr>
       </w:pPr>
       <w:r>
-        <w:t>Quản lý nghỉ phép</w:t>
-      </w:r>
+        <w:t xml:space="preserve">Quản </w:t>
+      </w:r>
+      <w:proofErr w:type="spellStart"/>
+      <w:r>
+        <w:t>lý</w:t>
+      </w:r>
+      <w:proofErr w:type="spellEnd"/>
+      <w:r>
+        <w:t xml:space="preserve"> </w:t>
+      </w:r>
+      <w:proofErr w:type="spellStart"/>
+      <w:r>
+        <w:t>nghỉ</w:t>
+      </w:r>
+      <w:proofErr w:type="spellEnd"/>
+      <w:r>
+        <w:t xml:space="preserve"> </w:t>
+      </w:r>
+      <w:proofErr w:type="spellStart"/>
+      <w:r>
+        <w:t>phép</w:t>
+      </w:r>
+      <w:proofErr w:type="spellEnd"/>
     </w:p>
     <w:p/>
     <w:p/>
@@ -258,11 +687,45 @@
         <w:t>2. Stakeholder:</w:t>
       </w:r>
       <w:r>
-        <w:t xml:space="preserve"> Nhân sự</w:t>
-      </w:r>
-      <w:r>
-        <w:t xml:space="preserve"> của công ty, Quản lý</w:t>
-      </w:r>
+        <w:t xml:space="preserve"> </w:t>
+      </w:r>
+      <w:proofErr w:type="spellStart"/>
+      <w:r>
+        <w:t>Nhân</w:t>
+      </w:r>
+      <w:proofErr w:type="spellEnd"/>
+      <w:r>
+        <w:t xml:space="preserve"> </w:t>
+      </w:r>
+      <w:proofErr w:type="spellStart"/>
+      <w:r>
+        <w:t>sự</w:t>
+      </w:r>
+      <w:proofErr w:type="spellEnd"/>
+      <w:r>
+        <w:t xml:space="preserve"> </w:t>
+      </w:r>
+      <w:proofErr w:type="spellStart"/>
+      <w:r>
+        <w:t>của</w:t>
+      </w:r>
+      <w:proofErr w:type="spellEnd"/>
+      <w:r>
+        <w:t xml:space="preserve"> </w:t>
+      </w:r>
+      <w:proofErr w:type="spellStart"/>
+      <w:r>
+        <w:t>công</w:t>
+      </w:r>
+      <w:proofErr w:type="spellEnd"/>
+      <w:r>
+        <w:t xml:space="preserve"> ty, Quản </w:t>
+      </w:r>
+      <w:proofErr w:type="spellStart"/>
+      <w:r>
+        <w:t>lý</w:t>
+      </w:r>
+      <w:proofErr w:type="spellEnd"/>
       <w:r>
         <w:br/>
         <w:t>3. Needs:</w:t>
@@ -270,34 +733,283 @@
       <w:r>
         <w:t xml:space="preserve"> </w:t>
       </w:r>
+      <w:proofErr w:type="spellStart"/>
       <w:r>
         <w:rPr>
           <w:i/>
           <w:iCs/>
         </w:rPr>
-        <w:t>nâng cao chất lượng quản lý</w:t>
-      </w:r>
+        <w:t>nâng</w:t>
+      </w:r>
+      <w:proofErr w:type="spellEnd"/>
+      <w:r>
+        <w:rPr>
+          <w:i/>
+          <w:iCs/>
+        </w:rPr>
+        <w:t xml:space="preserve"> </w:t>
+      </w:r>
+      <w:proofErr w:type="spellStart"/>
+      <w:r>
+        <w:rPr>
+          <w:i/>
+          <w:iCs/>
+        </w:rPr>
+        <w:t>cao</w:t>
+      </w:r>
+      <w:proofErr w:type="spellEnd"/>
+      <w:r>
+        <w:rPr>
+          <w:i/>
+          <w:iCs/>
+        </w:rPr>
+        <w:t xml:space="preserve"> </w:t>
+      </w:r>
+      <w:proofErr w:type="spellStart"/>
+      <w:r>
+        <w:rPr>
+          <w:i/>
+          <w:iCs/>
+        </w:rPr>
+        <w:t>chất</w:t>
+      </w:r>
+      <w:proofErr w:type="spellEnd"/>
+      <w:r>
+        <w:rPr>
+          <w:i/>
+          <w:iCs/>
+        </w:rPr>
+        <w:t xml:space="preserve"> </w:t>
+      </w:r>
+      <w:proofErr w:type="spellStart"/>
+      <w:r>
+        <w:rPr>
+          <w:i/>
+          <w:iCs/>
+        </w:rPr>
+        <w:t>lượng</w:t>
+      </w:r>
+      <w:proofErr w:type="spellEnd"/>
+      <w:r>
+        <w:rPr>
+          <w:i/>
+          <w:iCs/>
+        </w:rPr>
+        <w:t xml:space="preserve"> </w:t>
+      </w:r>
+      <w:proofErr w:type="spellStart"/>
+      <w:r>
+        <w:rPr>
+          <w:i/>
+          <w:iCs/>
+        </w:rPr>
+        <w:t>quản</w:t>
+      </w:r>
+      <w:proofErr w:type="spellEnd"/>
+      <w:r>
+        <w:rPr>
+          <w:i/>
+          <w:iCs/>
+        </w:rPr>
+        <w:t xml:space="preserve"> </w:t>
+      </w:r>
+      <w:proofErr w:type="spellStart"/>
+      <w:r>
+        <w:rPr>
+          <w:i/>
+          <w:iCs/>
+        </w:rPr>
+        <w:t>lý</w:t>
+      </w:r>
+      <w:proofErr w:type="spellEnd"/>
       <w:r>
         <w:br/>
         <w:t>4. Solution:</w:t>
       </w:r>
       <w:r>
-        <w:t xml:space="preserve"> Phần mềm quản lý nhân sự</w:t>
-      </w:r>
+        <w:t xml:space="preserve"> </w:t>
+      </w:r>
+      <w:proofErr w:type="spellStart"/>
+      <w:r>
+        <w:t>Phần</w:t>
+      </w:r>
+      <w:proofErr w:type="spellEnd"/>
+      <w:r>
+        <w:t xml:space="preserve"> </w:t>
+      </w:r>
+      <w:proofErr w:type="spellStart"/>
+      <w:r>
+        <w:t>mềm</w:t>
+      </w:r>
+      <w:proofErr w:type="spellEnd"/>
+      <w:r>
+        <w:t xml:space="preserve"> </w:t>
+      </w:r>
+      <w:proofErr w:type="spellStart"/>
+      <w:r>
+        <w:t>quản</w:t>
+      </w:r>
+      <w:proofErr w:type="spellEnd"/>
+      <w:r>
+        <w:t xml:space="preserve"> </w:t>
+      </w:r>
+      <w:proofErr w:type="spellStart"/>
+      <w:r>
+        <w:t>lý</w:t>
+      </w:r>
+      <w:proofErr w:type="spellEnd"/>
+      <w:r>
+        <w:t xml:space="preserve"> </w:t>
+      </w:r>
+      <w:proofErr w:type="spellStart"/>
+      <w:r>
+        <w:t>nhân</w:t>
+      </w:r>
+      <w:proofErr w:type="spellEnd"/>
+      <w:r>
+        <w:t xml:space="preserve"> </w:t>
+      </w:r>
+      <w:proofErr w:type="spellStart"/>
+      <w:r>
+        <w:t>sự</w:t>
+      </w:r>
+      <w:proofErr w:type="spellEnd"/>
       <w:r>
         <w:br/>
         <w:t>5. Change:</w:t>
       </w:r>
       <w:r>
-        <w:t xml:space="preserve"> cách quản lý nhân sự</w:t>
-      </w:r>
+        <w:t xml:space="preserve"> </w:t>
+      </w:r>
+      <w:proofErr w:type="spellStart"/>
+      <w:r>
+        <w:t>cách</w:t>
+      </w:r>
+      <w:proofErr w:type="spellEnd"/>
+      <w:r>
+        <w:t xml:space="preserve"> </w:t>
+      </w:r>
+      <w:proofErr w:type="spellStart"/>
+      <w:r>
+        <w:t>quản</w:t>
+      </w:r>
+      <w:proofErr w:type="spellEnd"/>
+      <w:r>
+        <w:t xml:space="preserve"> </w:t>
+      </w:r>
+      <w:proofErr w:type="spellStart"/>
+      <w:r>
+        <w:t>lý</w:t>
+      </w:r>
+      <w:proofErr w:type="spellEnd"/>
+      <w:r>
+        <w:t xml:space="preserve"> </w:t>
+      </w:r>
+      <w:proofErr w:type="spellStart"/>
+      <w:r>
+        <w:t>nhân</w:t>
+      </w:r>
+      <w:proofErr w:type="spellEnd"/>
+      <w:r>
+        <w:t xml:space="preserve"> </w:t>
+      </w:r>
+      <w:proofErr w:type="spellStart"/>
+      <w:r>
+        <w:t>sự</w:t>
+      </w:r>
+      <w:proofErr w:type="spellEnd"/>
       <w:r>
         <w:br/>
         <w:t>6. Value:</w:t>
       </w:r>
       <w:r>
-        <w:t xml:space="preserve"> quản lý hiệu quả hơn, nâng cao chất lượng nhân sự</w:t>
-      </w:r>
+        <w:t xml:space="preserve"> </w:t>
+      </w:r>
+      <w:proofErr w:type="spellStart"/>
+      <w:r>
+        <w:t>quản</w:t>
+      </w:r>
+      <w:proofErr w:type="spellEnd"/>
+      <w:r>
+        <w:t xml:space="preserve"> </w:t>
+      </w:r>
+      <w:proofErr w:type="spellStart"/>
+      <w:r>
+        <w:t>lý</w:t>
+      </w:r>
+      <w:proofErr w:type="spellEnd"/>
+      <w:r>
+        <w:t xml:space="preserve"> </w:t>
+      </w:r>
+      <w:proofErr w:type="spellStart"/>
+      <w:r>
+        <w:t>hiệu</w:t>
+      </w:r>
+      <w:proofErr w:type="spellEnd"/>
+      <w:r>
+        <w:t xml:space="preserve"> </w:t>
+      </w:r>
+      <w:proofErr w:type="spellStart"/>
+      <w:r>
+        <w:t>quả</w:t>
+      </w:r>
+      <w:proofErr w:type="spellEnd"/>
+      <w:r>
+        <w:t xml:space="preserve"> </w:t>
+      </w:r>
+      <w:proofErr w:type="spellStart"/>
+      <w:r>
+        <w:t>hơn</w:t>
+      </w:r>
+      <w:proofErr w:type="spellEnd"/>
+      <w:r>
+        <w:t xml:space="preserve">, </w:t>
+      </w:r>
+      <w:proofErr w:type="spellStart"/>
+      <w:r>
+        <w:t>nâng</w:t>
+      </w:r>
+      <w:proofErr w:type="spellEnd"/>
+      <w:r>
+        <w:t xml:space="preserve"> </w:t>
+      </w:r>
+      <w:proofErr w:type="spellStart"/>
+      <w:r>
+        <w:t>cao</w:t>
+      </w:r>
+      <w:proofErr w:type="spellEnd"/>
+      <w:r>
+        <w:t xml:space="preserve"> </w:t>
+      </w:r>
+      <w:proofErr w:type="spellStart"/>
+      <w:r>
+        <w:t>chất</w:t>
+      </w:r>
+      <w:proofErr w:type="spellEnd"/>
+      <w:r>
+        <w:t xml:space="preserve"> </w:t>
+      </w:r>
+      <w:proofErr w:type="spellStart"/>
+      <w:r>
+        <w:t>lượng</w:t>
+      </w:r>
+      <w:proofErr w:type="spellEnd"/>
+      <w:r>
+        <w:t xml:space="preserve"> </w:t>
+      </w:r>
+      <w:proofErr w:type="spellStart"/>
+      <w:r>
+        <w:t>nhân</w:t>
+      </w:r>
+      <w:proofErr w:type="spellEnd"/>
+      <w:r>
+        <w:t xml:space="preserve"> </w:t>
+      </w:r>
+      <w:proofErr w:type="spellStart"/>
+      <w:r>
+        <w:t>sự</w:t>
+      </w:r>
+      <w:proofErr w:type="spellEnd"/>
     </w:p>
     <w:p/>
     <w:p/>
@@ -314,8 +1026,49 @@
           <w:bCs/>
         </w:rPr>
         <w:lastRenderedPageBreak/>
-        <w:t>B1. List các đầu việc</w:t>
-      </w:r>
+        <w:t xml:space="preserve">B1. List </w:t>
+      </w:r>
+      <w:proofErr w:type="spellStart"/>
+      <w:r>
+        <w:rPr>
+          <w:b/>
+          <w:bCs/>
+        </w:rPr>
+        <w:t>các</w:t>
+      </w:r>
+      <w:proofErr w:type="spellEnd"/>
+      <w:r>
+        <w:rPr>
+          <w:b/>
+          <w:bCs/>
+        </w:rPr>
+        <w:t xml:space="preserve"> </w:t>
+      </w:r>
+      <w:proofErr w:type="spellStart"/>
+      <w:r>
+        <w:rPr>
+          <w:b/>
+          <w:bCs/>
+        </w:rPr>
+        <w:t>đầu</w:t>
+      </w:r>
+      <w:proofErr w:type="spellEnd"/>
+      <w:r>
+        <w:rPr>
+          <w:b/>
+          <w:bCs/>
+        </w:rPr>
+        <w:t xml:space="preserve"> </w:t>
+      </w:r>
+      <w:proofErr w:type="spellStart"/>
+      <w:r>
+        <w:rPr>
+          <w:b/>
+          <w:bCs/>
+        </w:rPr>
+        <w:t>việc</w:t>
+      </w:r>
+      <w:proofErr w:type="spellEnd"/>
     </w:p>
     <w:p>
       <w:pPr>
@@ -324,8 +1077,53 @@
           <w:numId w:val="5"/>
         </w:numPr>
       </w:pPr>
-      <w:r>
-        <w:t xml:space="preserve">Xác định nhu cầu tuyển dụng </w:t>
+      <w:proofErr w:type="spellStart"/>
+      <w:r>
+        <w:t>Xác</w:t>
+      </w:r>
+      <w:proofErr w:type="spellEnd"/>
+      <w:r>
+        <w:t xml:space="preserve"> </w:t>
+      </w:r>
+      <w:proofErr w:type="spellStart"/>
+      <w:r>
+        <w:t>định</w:t>
+      </w:r>
+      <w:proofErr w:type="spellEnd"/>
+      <w:r>
+        <w:t xml:space="preserve"> </w:t>
+      </w:r>
+      <w:proofErr w:type="spellStart"/>
+      <w:r>
+        <w:t>nhu</w:t>
+      </w:r>
+      <w:proofErr w:type="spellEnd"/>
+      <w:r>
+        <w:t xml:space="preserve"> </w:t>
+      </w:r>
+      <w:proofErr w:type="spellStart"/>
+      <w:r>
+        <w:t>cầu</w:t>
+      </w:r>
+      <w:proofErr w:type="spellEnd"/>
+      <w:r>
+        <w:t xml:space="preserve"> </w:t>
+      </w:r>
+      <w:proofErr w:type="spellStart"/>
+      <w:r>
+        <w:t>tuyển</w:t>
+      </w:r>
+      <w:proofErr w:type="spellEnd"/>
+      <w:r>
+        <w:t xml:space="preserve"> </w:t>
+      </w:r>
+      <w:proofErr w:type="spellStart"/>
+      <w:r>
+        <w:t>dụng</w:t>
+      </w:r>
+      <w:proofErr w:type="spellEnd"/>
+      <w:r>
+        <w:t xml:space="preserve"> </w:t>
       </w:r>
     </w:p>
     <w:p>
@@ -335,8 +1133,37 @@
           <w:numId w:val="5"/>
         </w:numPr>
       </w:pPr>
-      <w:r>
-        <w:t xml:space="preserve">Đăng bài tuyển dụng </w:t>
+      <w:proofErr w:type="spellStart"/>
+      <w:r>
+        <w:t>Đăng</w:t>
+      </w:r>
+      <w:proofErr w:type="spellEnd"/>
+      <w:r>
+        <w:t xml:space="preserve"> </w:t>
+      </w:r>
+      <w:proofErr w:type="spellStart"/>
+      <w:r>
+        <w:t>bài</w:t>
+      </w:r>
+      <w:proofErr w:type="spellEnd"/>
+      <w:r>
+        <w:t xml:space="preserve"> </w:t>
+      </w:r>
+      <w:proofErr w:type="spellStart"/>
+      <w:r>
+        <w:t>tuyển</w:t>
+      </w:r>
+      <w:proofErr w:type="spellEnd"/>
+      <w:r>
+        <w:t xml:space="preserve"> </w:t>
+      </w:r>
+      <w:proofErr w:type="spellStart"/>
+      <w:r>
+        <w:t>dụng</w:t>
+      </w:r>
+      <w:proofErr w:type="spellEnd"/>
+      <w:r>
+        <w:t xml:space="preserve"> </w:t>
       </w:r>
     </w:p>
     <w:p>
@@ -346,8 +1173,21 @@
           <w:numId w:val="5"/>
         </w:numPr>
       </w:pPr>
-      <w:r>
-        <w:t xml:space="preserve">Nhận &amp; lọc CV </w:t>
+      <w:proofErr w:type="spellStart"/>
+      <w:r>
+        <w:t>Nhận</w:t>
+      </w:r>
+      <w:proofErr w:type="spellEnd"/>
+      <w:r>
+        <w:t xml:space="preserve"> &amp; </w:t>
+      </w:r>
+      <w:proofErr w:type="spellStart"/>
+      <w:r>
+        <w:t>lọc</w:t>
+      </w:r>
+      <w:proofErr w:type="spellEnd"/>
+      <w:r>
+        <w:t xml:space="preserve"> CV </w:t>
       </w:r>
     </w:p>
     <w:p>
@@ -357,8 +1197,45 @@
           <w:numId w:val="5"/>
         </w:numPr>
       </w:pPr>
-      <w:r>
-        <w:t xml:space="preserve">Sắp xếp lịch phỏng vấn </w:t>
+      <w:proofErr w:type="spellStart"/>
+      <w:r>
+        <w:t>Sắp</w:t>
+      </w:r>
+      <w:proofErr w:type="spellEnd"/>
+      <w:r>
+        <w:t xml:space="preserve"> </w:t>
+      </w:r>
+      <w:proofErr w:type="spellStart"/>
+      <w:r>
+        <w:t>xếp</w:t>
+      </w:r>
+      <w:proofErr w:type="spellEnd"/>
+      <w:r>
+        <w:t xml:space="preserve"> </w:t>
+      </w:r>
+      <w:proofErr w:type="spellStart"/>
+      <w:r>
+        <w:t>lịch</w:t>
+      </w:r>
+      <w:proofErr w:type="spellEnd"/>
+      <w:r>
+        <w:t xml:space="preserve"> </w:t>
+      </w:r>
+      <w:proofErr w:type="spellStart"/>
+      <w:r>
+        <w:t>phỏng</w:t>
+      </w:r>
+      <w:proofErr w:type="spellEnd"/>
+      <w:r>
+        <w:t xml:space="preserve"> </w:t>
+      </w:r>
+      <w:proofErr w:type="spellStart"/>
+      <w:r>
+        <w:t>vấn</w:t>
+      </w:r>
+      <w:proofErr w:type="spellEnd"/>
+      <w:r>
+        <w:t xml:space="preserve"> </w:t>
       </w:r>
     </w:p>
     <w:p>
@@ -368,8 +1245,37 @@
           <w:numId w:val="5"/>
         </w:numPr>
       </w:pPr>
-      <w:r>
-        <w:t xml:space="preserve">Phỏng vấn ứng viên </w:t>
+      <w:proofErr w:type="spellStart"/>
+      <w:r>
+        <w:t>Phỏng</w:t>
+      </w:r>
+      <w:proofErr w:type="spellEnd"/>
+      <w:r>
+        <w:t xml:space="preserve"> </w:t>
+      </w:r>
+      <w:proofErr w:type="spellStart"/>
+      <w:r>
+        <w:t>vấn</w:t>
+      </w:r>
+      <w:proofErr w:type="spellEnd"/>
+      <w:r>
+        <w:t xml:space="preserve"> </w:t>
+      </w:r>
+      <w:proofErr w:type="spellStart"/>
+      <w:r>
+        <w:t>ứng</w:t>
+      </w:r>
+      <w:proofErr w:type="spellEnd"/>
+      <w:r>
+        <w:t xml:space="preserve"> </w:t>
+      </w:r>
+      <w:proofErr w:type="spellStart"/>
+      <w:r>
+        <w:t>viên</w:t>
+      </w:r>
+      <w:proofErr w:type="spellEnd"/>
+      <w:r>
+        <w:t xml:space="preserve"> </w:t>
       </w:r>
     </w:p>
     <w:p>
@@ -379,8 +1285,37 @@
           <w:numId w:val="5"/>
         </w:numPr>
       </w:pPr>
-      <w:r>
-        <w:t xml:space="preserve">Đánh giá ứng viên </w:t>
+      <w:proofErr w:type="spellStart"/>
+      <w:r>
+        <w:t>Đánh</w:t>
+      </w:r>
+      <w:proofErr w:type="spellEnd"/>
+      <w:r>
+        <w:t xml:space="preserve"> </w:t>
+      </w:r>
+      <w:proofErr w:type="spellStart"/>
+      <w:r>
+        <w:t>giá</w:t>
+      </w:r>
+      <w:proofErr w:type="spellEnd"/>
+      <w:r>
+        <w:t xml:space="preserve"> </w:t>
+      </w:r>
+      <w:proofErr w:type="spellStart"/>
+      <w:r>
+        <w:t>ứng</w:t>
+      </w:r>
+      <w:proofErr w:type="spellEnd"/>
+      <w:r>
+        <w:t xml:space="preserve"> </w:t>
+      </w:r>
+      <w:proofErr w:type="spellStart"/>
+      <w:r>
+        <w:t>viên</w:t>
+      </w:r>
+      <w:proofErr w:type="spellEnd"/>
+      <w:r>
+        <w:t xml:space="preserve"> </w:t>
       </w:r>
     </w:p>
     <w:p>
@@ -390,8 +1325,29 @@
           <w:numId w:val="5"/>
         </w:numPr>
       </w:pPr>
-      <w:r>
-        <w:t xml:space="preserve">Quyết định tuyển </w:t>
+      <w:proofErr w:type="spellStart"/>
+      <w:r>
+        <w:t>Quyết</w:t>
+      </w:r>
+      <w:proofErr w:type="spellEnd"/>
+      <w:r>
+        <w:t xml:space="preserve"> </w:t>
+      </w:r>
+      <w:proofErr w:type="spellStart"/>
+      <w:r>
+        <w:t>định</w:t>
+      </w:r>
+      <w:proofErr w:type="spellEnd"/>
+      <w:r>
+        <w:t xml:space="preserve"> </w:t>
+      </w:r>
+      <w:proofErr w:type="spellStart"/>
+      <w:r>
+        <w:t>tuyển</w:t>
+      </w:r>
+      <w:proofErr w:type="spellEnd"/>
+      <w:r>
+        <w:t xml:space="preserve"> </w:t>
       </w:r>
     </w:p>
     <w:p>
@@ -401,8 +1357,13 @@
           <w:numId w:val="5"/>
         </w:numPr>
       </w:pPr>
-      <w:r>
-        <w:t xml:space="preserve">Gửi offer </w:t>
+      <w:proofErr w:type="spellStart"/>
+      <w:r>
+        <w:t>Gửi</w:t>
+      </w:r>
+      <w:proofErr w:type="spellEnd"/>
+      <w:r>
+        <w:t xml:space="preserve"> offer </w:t>
       </w:r>
     </w:p>
     <w:p>
@@ -428,8 +1389,49 @@
           <w:b/>
           <w:bCs/>
         </w:rPr>
-        <w:t xml:space="preserve"> B2. Các bên liên quan</w:t>
-      </w:r>
+        <w:t xml:space="preserve"> B2. Các </w:t>
+      </w:r>
+      <w:proofErr w:type="spellStart"/>
+      <w:r>
+        <w:rPr>
+          <w:b/>
+          <w:bCs/>
+        </w:rPr>
+        <w:t>bên</w:t>
+      </w:r>
+      <w:proofErr w:type="spellEnd"/>
+      <w:r>
+        <w:rPr>
+          <w:b/>
+          <w:bCs/>
+        </w:rPr>
+        <w:t xml:space="preserve"> </w:t>
+      </w:r>
+      <w:proofErr w:type="spellStart"/>
+      <w:r>
+        <w:rPr>
+          <w:b/>
+          <w:bCs/>
+        </w:rPr>
+        <w:t>liên</w:t>
+      </w:r>
+      <w:proofErr w:type="spellEnd"/>
+      <w:r>
+        <w:rPr>
+          <w:b/>
+          <w:bCs/>
+        </w:rPr>
+        <w:t xml:space="preserve"> </w:t>
+      </w:r>
+      <w:proofErr w:type="spellStart"/>
+      <w:r>
+        <w:rPr>
+          <w:b/>
+          <w:bCs/>
+        </w:rPr>
+        <w:t>quan</w:t>
+      </w:r>
+      <w:proofErr w:type="spellEnd"/>
     </w:p>
     <w:p>
       <w:pPr>
@@ -446,7 +1448,23 @@
         <w:t>HR</w:t>
       </w:r>
       <w:r>
-        <w:t xml:space="preserve"> (Nhân sự) </w:t>
+        <w:t xml:space="preserve"> (</w:t>
+      </w:r>
+      <w:proofErr w:type="spellStart"/>
+      <w:r>
+        <w:t>Nhân</w:t>
+      </w:r>
+      <w:proofErr w:type="spellEnd"/>
+      <w:r>
+        <w:t xml:space="preserve"> </w:t>
+      </w:r>
+      <w:proofErr w:type="spellStart"/>
+      <w:r>
+        <w:t>sự</w:t>
+      </w:r>
+      <w:proofErr w:type="spellEnd"/>
+      <w:r>
+        <w:t xml:space="preserve">) </w:t>
       </w:r>
     </w:p>
     <w:p>
@@ -482,7 +1500,47 @@
         <w:t>Interviewer</w:t>
       </w:r>
       <w:r>
-        <w:t xml:space="preserve"> (Người phỏng vấn / chuyên môn) </w:t>
+        <w:t xml:space="preserve"> (</w:t>
+      </w:r>
+      <w:proofErr w:type="spellStart"/>
+      <w:r>
+        <w:t>Người</w:t>
+      </w:r>
+      <w:proofErr w:type="spellEnd"/>
+      <w:r>
+        <w:t xml:space="preserve"> </w:t>
+      </w:r>
+      <w:proofErr w:type="spellStart"/>
+      <w:r>
+        <w:t>phỏng</w:t>
+      </w:r>
+      <w:proofErr w:type="spellEnd"/>
+      <w:r>
+        <w:t xml:space="preserve"> </w:t>
+      </w:r>
+      <w:proofErr w:type="spellStart"/>
+      <w:r>
+        <w:t>vấn</w:t>
+      </w:r>
+      <w:proofErr w:type="spellEnd"/>
+      <w:r>
+        <w:t xml:space="preserve"> / </w:t>
+      </w:r>
+      <w:proofErr w:type="spellStart"/>
+      <w:r>
+        <w:t>chuyên</w:t>
+      </w:r>
+      <w:proofErr w:type="spellEnd"/>
+      <w:r>
+        <w:t xml:space="preserve"> </w:t>
+      </w:r>
+      <w:proofErr w:type="spellStart"/>
+      <w:r>
+        <w:t>môn</w:t>
+      </w:r>
+      <w:proofErr w:type="spellEnd"/>
+      <w:r>
+        <w:t xml:space="preserve">) </w:t>
       </w:r>
     </w:p>
     <w:p>
@@ -492,13 +1550,31 @@
           <w:numId w:val="6"/>
         </w:numPr>
       </w:pPr>
+      <w:proofErr w:type="spellStart"/>
       <w:r>
         <w:rPr>
           <w:b/>
           <w:bCs/>
         </w:rPr>
-        <w:t>Ứng viên</w:t>
-      </w:r>
+        <w:t>Ứng</w:t>
+      </w:r>
+      <w:proofErr w:type="spellEnd"/>
+      <w:r>
+        <w:rPr>
+          <w:b/>
+          <w:bCs/>
+        </w:rPr>
+        <w:t xml:space="preserve"> </w:t>
+      </w:r>
+      <w:proofErr w:type="spellStart"/>
+      <w:r>
+        <w:rPr>
+          <w:b/>
+          <w:bCs/>
+        </w:rPr>
+        <w:t>viên</w:t>
+      </w:r>
+      <w:proofErr w:type="spellEnd"/>
       <w:r>
         <w:t xml:space="preserve"> </w:t>
       </w:r>
@@ -510,30 +1586,87 @@
           <w:numId w:val="6"/>
         </w:numPr>
       </w:pPr>
+      <w:proofErr w:type="spellStart"/>
       <w:r>
         <w:rPr>
           <w:b/>
           <w:bCs/>
         </w:rPr>
-        <w:t>Người request</w:t>
-      </w:r>
-      <w:r>
-        <w:t xml:space="preserve"> (người yêu cầu tuyển) </w:t>
-      </w:r>
-    </w:p>
-    <w:p>
-      <w:pPr>
+        <w:t>Người</w:t>
+      </w:r>
+      <w:proofErr w:type="spellEnd"/>
+      <w:r>
         <w:rPr>
           <w:b/>
           <w:bCs/>
         </w:rPr>
-      </w:pPr>
-      <w:r>
+        <w:t xml:space="preserve"> request</w:t>
+      </w:r>
+      <w:r>
+        <w:t xml:space="preserve"> (</w:t>
+      </w:r>
+      <w:proofErr w:type="spellStart"/>
+      <w:r>
+        <w:t>người</w:t>
+      </w:r>
+      <w:proofErr w:type="spellEnd"/>
+      <w:r>
+        <w:t xml:space="preserve"> </w:t>
+      </w:r>
+      <w:proofErr w:type="spellStart"/>
+      <w:r>
+        <w:t>yêu</w:t>
+      </w:r>
+      <w:proofErr w:type="spellEnd"/>
+      <w:r>
+        <w:t xml:space="preserve"> </w:t>
+      </w:r>
+      <w:proofErr w:type="spellStart"/>
+      <w:r>
+        <w:t>cầu</w:t>
+      </w:r>
+      <w:proofErr w:type="spellEnd"/>
+      <w:r>
+        <w:t xml:space="preserve"> </w:t>
+      </w:r>
+      <w:proofErr w:type="spellStart"/>
+      <w:r>
+        <w:t>tuyển</w:t>
+      </w:r>
+      <w:proofErr w:type="spellEnd"/>
+      <w:r>
+        <w:t xml:space="preserve">) </w:t>
+      </w:r>
+    </w:p>
+    <w:p>
+      <w:pPr>
         <w:rPr>
           <w:b/>
           <w:bCs/>
         </w:rPr>
-        <w:t>B3. Ma trận RACI</w:t>
+      </w:pPr>
+      <w:r>
+        <w:rPr>
+          <w:b/>
+          <w:bCs/>
+        </w:rPr>
+        <w:t xml:space="preserve">B3. Ma </w:t>
+      </w:r>
+      <w:proofErr w:type="spellStart"/>
+      <w:r>
+        <w:rPr>
+          <w:b/>
+          <w:bCs/>
+        </w:rPr>
+        <w:t>trận</w:t>
+      </w:r>
+      <w:proofErr w:type="spellEnd"/>
+      <w:r>
+        <w:rPr>
+          <w:b/>
+          <w:bCs/>
+        </w:rPr>
+        <w:t xml:space="preserve"> RACI</w:t>
       </w:r>
     </w:p>
     <w:tbl>
@@ -569,8 +1702,17 @@
                 <w:b/>
                 <w:bCs/>
               </w:rPr>
-              <w:t>Công việc</w:t>
-            </w:r>
+              <w:t xml:space="preserve">Công </w:t>
+            </w:r>
+            <w:proofErr w:type="spellStart"/>
+            <w:r>
+              <w:rPr>
+                <w:b/>
+                <w:bCs/>
+              </w:rPr>
+              <w:t>việc</w:t>
+            </w:r>
+            <w:proofErr w:type="spellEnd"/>
           </w:p>
         </w:tc>
         <w:tc>
@@ -652,34 +1794,61 @@
                 <w:bCs/>
               </w:rPr>
             </w:pPr>
+            <w:proofErr w:type="spellStart"/>
             <w:r>
               <w:rPr>
                 <w:b/>
                 <w:bCs/>
               </w:rPr>
-              <w:t>Ứng viên</w:t>
-            </w:r>
-          </w:p>
-        </w:tc>
-        <w:tc>
-          <w:tcPr>
-            <w:tcW w:w="0" w:type="auto"/>
-            <w:hideMark/>
-          </w:tcPr>
-          <w:p>
-            <w:pPr>
-              <w:spacing w:after="160" w:line="259" w:lineRule="auto"/>
+              <w:t>Ứng</w:t>
+            </w:r>
+            <w:proofErr w:type="spellEnd"/>
+            <w:r>
               <w:rPr>
                 <w:b/>
                 <w:bCs/>
               </w:rPr>
-            </w:pPr>
+              <w:t xml:space="preserve"> </w:t>
+            </w:r>
+            <w:proofErr w:type="spellStart"/>
             <w:r>
               <w:rPr>
                 <w:b/>
                 <w:bCs/>
               </w:rPr>
-              <w:t>Người request</w:t>
+              <w:t>viên</w:t>
+            </w:r>
+            <w:proofErr w:type="spellEnd"/>
+          </w:p>
+        </w:tc>
+        <w:tc>
+          <w:tcPr>
+            <w:tcW w:w="0" w:type="auto"/>
+            <w:hideMark/>
+          </w:tcPr>
+          <w:p>
+            <w:pPr>
+              <w:spacing w:after="160" w:line="259" w:lineRule="auto"/>
+              <w:rPr>
+                <w:b/>
+                <w:bCs/>
+              </w:rPr>
+            </w:pPr>
+            <w:proofErr w:type="spellStart"/>
+            <w:r>
+              <w:rPr>
+                <w:b/>
+                <w:bCs/>
+              </w:rPr>
+              <w:t>Người</w:t>
+            </w:r>
+            <w:proofErr w:type="spellEnd"/>
+            <w:r>
+              <w:rPr>
+                <w:b/>
+                <w:bCs/>
+              </w:rPr>
+              <w:t xml:space="preserve"> request</w:t>
             </w:r>
           </w:p>
         </w:tc>
@@ -694,9 +1863,43 @@
             <w:pPr>
               <w:spacing w:after="160" w:line="259" w:lineRule="auto"/>
             </w:pPr>
-            <w:r>
-              <w:t>Xác định nhu cầu tuyển</w:t>
-            </w:r>
+            <w:proofErr w:type="spellStart"/>
+            <w:r>
+              <w:t>Xác</w:t>
+            </w:r>
+            <w:proofErr w:type="spellEnd"/>
+            <w:r>
+              <w:t xml:space="preserve"> </w:t>
+            </w:r>
+            <w:proofErr w:type="spellStart"/>
+            <w:r>
+              <w:t>định</w:t>
+            </w:r>
+            <w:proofErr w:type="spellEnd"/>
+            <w:r>
+              <w:t xml:space="preserve"> </w:t>
+            </w:r>
+            <w:proofErr w:type="spellStart"/>
+            <w:r>
+              <w:t>nhu</w:t>
+            </w:r>
+            <w:proofErr w:type="spellEnd"/>
+            <w:r>
+              <w:t xml:space="preserve"> </w:t>
+            </w:r>
+            <w:proofErr w:type="spellStart"/>
+            <w:r>
+              <w:t>cầu</w:t>
+            </w:r>
+            <w:proofErr w:type="spellEnd"/>
+            <w:r>
+              <w:t xml:space="preserve"> </w:t>
+            </w:r>
+            <w:proofErr w:type="spellStart"/>
+            <w:r>
+              <w:t>tuyển</w:t>
+            </w:r>
+            <w:proofErr w:type="spellEnd"/>
           </w:p>
         </w:tc>
         <w:tc>
@@ -780,9 +1983,35 @@
             <w:pPr>
               <w:spacing w:after="160" w:line="259" w:lineRule="auto"/>
             </w:pPr>
-            <w:r>
-              <w:t>Đăng bài tuyển dụng</w:t>
-            </w:r>
+            <w:proofErr w:type="spellStart"/>
+            <w:r>
+              <w:t>Đăng</w:t>
+            </w:r>
+            <w:proofErr w:type="spellEnd"/>
+            <w:r>
+              <w:t xml:space="preserve"> </w:t>
+            </w:r>
+            <w:proofErr w:type="spellStart"/>
+            <w:r>
+              <w:t>bài</w:t>
+            </w:r>
+            <w:proofErr w:type="spellEnd"/>
+            <w:r>
+              <w:t xml:space="preserve"> </w:t>
+            </w:r>
+            <w:proofErr w:type="spellStart"/>
+            <w:r>
+              <w:t>tuyển</w:t>
+            </w:r>
+            <w:proofErr w:type="spellEnd"/>
+            <w:r>
+              <w:t xml:space="preserve"> </w:t>
+            </w:r>
+            <w:proofErr w:type="spellStart"/>
+            <w:r>
+              <w:t>dụng</w:t>
+            </w:r>
+            <w:proofErr w:type="spellEnd"/>
           </w:p>
         </w:tc>
         <w:tc>
@@ -866,8 +2095,21 @@
             <w:pPr>
               <w:spacing w:after="160" w:line="259" w:lineRule="auto"/>
             </w:pPr>
-            <w:r>
-              <w:t>Nhận &amp; lọc CV</w:t>
+            <w:proofErr w:type="spellStart"/>
+            <w:r>
+              <w:t>Nhận</w:t>
+            </w:r>
+            <w:proofErr w:type="spellEnd"/>
+            <w:r>
+              <w:t xml:space="preserve"> &amp; </w:t>
+            </w:r>
+            <w:proofErr w:type="spellStart"/>
+            <w:r>
+              <w:t>lọc</w:t>
+            </w:r>
+            <w:proofErr w:type="spellEnd"/>
+            <w:r>
+              <w:t xml:space="preserve"> CV</w:t>
             </w:r>
           </w:p>
         </w:tc>
@@ -952,8 +2194,29 @@
             <w:pPr>
               <w:spacing w:after="160" w:line="259" w:lineRule="auto"/>
             </w:pPr>
-            <w:r>
-              <w:t>Sắp xếp lịch PV</w:t>
+            <w:proofErr w:type="spellStart"/>
+            <w:r>
+              <w:t>Sắp</w:t>
+            </w:r>
+            <w:proofErr w:type="spellEnd"/>
+            <w:r>
+              <w:t xml:space="preserve"> </w:t>
+            </w:r>
+            <w:proofErr w:type="spellStart"/>
+            <w:r>
+              <w:t>xếp</w:t>
+            </w:r>
+            <w:proofErr w:type="spellEnd"/>
+            <w:r>
+              <w:t xml:space="preserve"> </w:t>
+            </w:r>
+            <w:proofErr w:type="spellStart"/>
+            <w:r>
+              <w:t>lịch</w:t>
+            </w:r>
+            <w:proofErr w:type="spellEnd"/>
+            <w:r>
+              <w:t xml:space="preserve"> PV</w:t>
             </w:r>
           </w:p>
         </w:tc>
@@ -1038,9 +2301,35 @@
             <w:pPr>
               <w:spacing w:after="160" w:line="259" w:lineRule="auto"/>
             </w:pPr>
-            <w:r>
-              <w:t>Phỏng vấn ứng viên</w:t>
-            </w:r>
+            <w:proofErr w:type="spellStart"/>
+            <w:r>
+              <w:t>Phỏng</w:t>
+            </w:r>
+            <w:proofErr w:type="spellEnd"/>
+            <w:r>
+              <w:t xml:space="preserve"> </w:t>
+            </w:r>
+            <w:proofErr w:type="spellStart"/>
+            <w:r>
+              <w:t>vấn</w:t>
+            </w:r>
+            <w:proofErr w:type="spellEnd"/>
+            <w:r>
+              <w:t xml:space="preserve"> </w:t>
+            </w:r>
+            <w:proofErr w:type="spellStart"/>
+            <w:r>
+              <w:t>ứng</w:t>
+            </w:r>
+            <w:proofErr w:type="spellEnd"/>
+            <w:r>
+              <w:t xml:space="preserve"> </w:t>
+            </w:r>
+            <w:proofErr w:type="spellStart"/>
+            <w:r>
+              <w:t>viên</w:t>
+            </w:r>
+            <w:proofErr w:type="spellEnd"/>
           </w:p>
         </w:tc>
         <w:tc>
@@ -1124,9 +2413,35 @@
             <w:pPr>
               <w:spacing w:after="160" w:line="259" w:lineRule="auto"/>
             </w:pPr>
-            <w:r>
-              <w:t>Đánh giá ứng viên</w:t>
-            </w:r>
+            <w:proofErr w:type="spellStart"/>
+            <w:r>
+              <w:t>Đánh</w:t>
+            </w:r>
+            <w:proofErr w:type="spellEnd"/>
+            <w:r>
+              <w:t xml:space="preserve"> </w:t>
+            </w:r>
+            <w:proofErr w:type="spellStart"/>
+            <w:r>
+              <w:t>giá</w:t>
+            </w:r>
+            <w:proofErr w:type="spellEnd"/>
+            <w:r>
+              <w:t xml:space="preserve"> </w:t>
+            </w:r>
+            <w:proofErr w:type="spellStart"/>
+            <w:r>
+              <w:t>ứng</w:t>
+            </w:r>
+            <w:proofErr w:type="spellEnd"/>
+            <w:r>
+              <w:t xml:space="preserve"> </w:t>
+            </w:r>
+            <w:proofErr w:type="spellStart"/>
+            <w:r>
+              <w:t>viên</w:t>
+            </w:r>
+            <w:proofErr w:type="spellEnd"/>
           </w:p>
         </w:tc>
         <w:tc>
@@ -1210,9 +2525,27 @@
             <w:pPr>
               <w:spacing w:after="160" w:line="259" w:lineRule="auto"/>
             </w:pPr>
-            <w:r>
-              <w:t>Quyết định tuyển</w:t>
-            </w:r>
+            <w:proofErr w:type="spellStart"/>
+            <w:r>
+              <w:t>Quyết</w:t>
+            </w:r>
+            <w:proofErr w:type="spellEnd"/>
+            <w:r>
+              <w:t xml:space="preserve"> </w:t>
+            </w:r>
+            <w:proofErr w:type="spellStart"/>
+            <w:r>
+              <w:t>định</w:t>
+            </w:r>
+            <w:proofErr w:type="spellEnd"/>
+            <w:r>
+              <w:t xml:space="preserve"> </w:t>
+            </w:r>
+            <w:proofErr w:type="spellStart"/>
+            <w:r>
+              <w:t>tuyển</w:t>
+            </w:r>
+            <w:proofErr w:type="spellEnd"/>
           </w:p>
         </w:tc>
         <w:tc>
@@ -1296,8 +2629,13 @@
             <w:pPr>
               <w:spacing w:after="160" w:line="259" w:lineRule="auto"/>
             </w:pPr>
-            <w:r>
-              <w:t>Gửi offer</w:t>
+            <w:proofErr w:type="spellStart"/>
+            <w:r>
+              <w:t>Gửi</w:t>
+            </w:r>
+            <w:proofErr w:type="spellEnd"/>
+            <w:r>
+              <w:t xml:space="preserve"> offer</w:t>
             </w:r>
           </w:p>
         </w:tc>
@@ -1464,27 +2802,114 @@
     <w:p/>
     <w:p>
       <w:r>
-        <w:t>■ Responsible: Người thực</w:t>
-      </w:r>
-      <w:r>
-        <w:t xml:space="preserve"> </w:t>
-      </w:r>
-      <w:r>
-        <w:t>hiện công việc</w:t>
-      </w:r>
+        <w:t xml:space="preserve">■ Responsible: </w:t>
+      </w:r>
+      <w:proofErr w:type="spellStart"/>
+      <w:r>
+        <w:t>Người</w:t>
+      </w:r>
+      <w:proofErr w:type="spellEnd"/>
+      <w:r>
+        <w:t xml:space="preserve"> </w:t>
+      </w:r>
+      <w:proofErr w:type="spellStart"/>
+      <w:r>
+        <w:t>thực</w:t>
+      </w:r>
+      <w:proofErr w:type="spellEnd"/>
+      <w:r>
+        <w:t xml:space="preserve"> </w:t>
+      </w:r>
+      <w:proofErr w:type="spellStart"/>
+      <w:r>
+        <w:t>hiện</w:t>
+      </w:r>
+      <w:proofErr w:type="spellEnd"/>
+      <w:r>
+        <w:t xml:space="preserve"> </w:t>
+      </w:r>
+      <w:proofErr w:type="spellStart"/>
+      <w:r>
+        <w:t>công</w:t>
+      </w:r>
+      <w:proofErr w:type="spellEnd"/>
+      <w:r>
+        <w:t xml:space="preserve"> </w:t>
+      </w:r>
+      <w:proofErr w:type="spellStart"/>
+      <w:r>
+        <w:t>việc</w:t>
+      </w:r>
+      <w:proofErr w:type="spellEnd"/>
       <w:r>
         <w:br/>
-        <w:t>■ Accountable: Người quyết</w:t>
-      </w:r>
-      <w:r>
-        <w:t xml:space="preserve"> </w:t>
-      </w:r>
-      <w:r>
-        <w:t>định và có quyền sở hữu</w:t>
-      </w:r>
-      <w:r>
-        <w:t xml:space="preserve"> </w:t>
-      </w:r>
+        <w:t xml:space="preserve">■ Accountable: </w:t>
+      </w:r>
+      <w:proofErr w:type="spellStart"/>
+      <w:r>
+        <w:t>Người</w:t>
+      </w:r>
+      <w:proofErr w:type="spellEnd"/>
+      <w:r>
+        <w:t xml:space="preserve"> </w:t>
+      </w:r>
+      <w:proofErr w:type="spellStart"/>
+      <w:r>
+        <w:t>quyết</w:t>
+      </w:r>
+      <w:proofErr w:type="spellEnd"/>
+      <w:r>
+        <w:t xml:space="preserve"> </w:t>
+      </w:r>
+      <w:proofErr w:type="spellStart"/>
+      <w:r>
+        <w:t>định</w:t>
+      </w:r>
+      <w:proofErr w:type="spellEnd"/>
+      <w:r>
+        <w:t xml:space="preserve"> </w:t>
+      </w:r>
+      <w:proofErr w:type="spellStart"/>
+      <w:r>
+        <w:t>và</w:t>
+      </w:r>
+      <w:proofErr w:type="spellEnd"/>
+      <w:r>
+        <w:t xml:space="preserve"> </w:t>
+      </w:r>
+      <w:proofErr w:type="spellStart"/>
+      <w:r>
+        <w:t>có</w:t>
+      </w:r>
+      <w:proofErr w:type="spellEnd"/>
+      <w:r>
+        <w:t xml:space="preserve"> </w:t>
+      </w:r>
+      <w:proofErr w:type="spellStart"/>
+      <w:r>
+        <w:t>quyền</w:t>
+      </w:r>
+      <w:proofErr w:type="spellEnd"/>
+      <w:r>
+        <w:t xml:space="preserve"> </w:t>
+      </w:r>
+      <w:proofErr w:type="spellStart"/>
+      <w:r>
+        <w:t>sở</w:t>
+      </w:r>
+      <w:proofErr w:type="spellEnd"/>
+      <w:r>
+        <w:t xml:space="preserve"> </w:t>
+      </w:r>
+      <w:proofErr w:type="spellStart"/>
+      <w:r>
+        <w:t>hữu</w:t>
+      </w:r>
+      <w:proofErr w:type="spellEnd"/>
+      <w:r>
+        <w:t xml:space="preserve"> </w:t>
+      </w:r>
+      <w:proofErr w:type="spellStart"/>
       <w:r>
         <w:t>cu</w:t>
       </w:r>
@@ -1492,52 +2917,353 @@
         <w:t>ố</w:t>
       </w:r>
       <w:r>
-        <w:t>i cùng</w:t>
-      </w:r>
+        <w:t>i</w:t>
+      </w:r>
+      <w:proofErr w:type="spellEnd"/>
+      <w:r>
+        <w:t xml:space="preserve"> </w:t>
+      </w:r>
+      <w:proofErr w:type="spellStart"/>
+      <w:r>
+        <w:t>cùng</w:t>
+      </w:r>
+      <w:proofErr w:type="spellEnd"/>
       <w:r>
         <w:br/>
-        <w:t>■ Consult: Người được tham</w:t>
-      </w:r>
-      <w:r>
-        <w:t xml:space="preserve"> </w:t>
-      </w:r>
-      <w:r>
-        <w:t>khảo ý kiến trước khi đưa ra</w:t>
-      </w:r>
-      <w:r>
-        <w:t xml:space="preserve"> </w:t>
-      </w:r>
-      <w:r>
-        <w:t>quyết định</w:t>
-      </w:r>
+        <w:t xml:space="preserve">■ Consult: </w:t>
+      </w:r>
+      <w:proofErr w:type="spellStart"/>
+      <w:r>
+        <w:t>Người</w:t>
+      </w:r>
+      <w:proofErr w:type="spellEnd"/>
+      <w:r>
+        <w:t xml:space="preserve"> </w:t>
+      </w:r>
+      <w:proofErr w:type="spellStart"/>
+      <w:r>
+        <w:t>được</w:t>
+      </w:r>
+      <w:proofErr w:type="spellEnd"/>
+      <w:r>
+        <w:t xml:space="preserve"> </w:t>
+      </w:r>
+      <w:proofErr w:type="spellStart"/>
+      <w:r>
+        <w:t>tham</w:t>
+      </w:r>
+      <w:proofErr w:type="spellEnd"/>
+      <w:r>
+        <w:t xml:space="preserve"> </w:t>
+      </w:r>
+      <w:proofErr w:type="spellStart"/>
+      <w:r>
+        <w:t>khảo</w:t>
+      </w:r>
+      <w:proofErr w:type="spellEnd"/>
+      <w:r>
+        <w:t xml:space="preserve"> ý </w:t>
+      </w:r>
+      <w:proofErr w:type="spellStart"/>
+      <w:r>
+        <w:t>kiến</w:t>
+      </w:r>
+      <w:proofErr w:type="spellEnd"/>
+      <w:r>
+        <w:t xml:space="preserve"> </w:t>
+      </w:r>
+      <w:proofErr w:type="spellStart"/>
+      <w:r>
+        <w:t>trước</w:t>
+      </w:r>
+      <w:proofErr w:type="spellEnd"/>
+      <w:r>
+        <w:t xml:space="preserve"> </w:t>
+      </w:r>
+      <w:proofErr w:type="spellStart"/>
+      <w:r>
+        <w:t>khi</w:t>
+      </w:r>
+      <w:proofErr w:type="spellEnd"/>
+      <w:r>
+        <w:t xml:space="preserve"> </w:t>
+      </w:r>
+      <w:proofErr w:type="spellStart"/>
+      <w:r>
+        <w:t>đưa</w:t>
+      </w:r>
+      <w:proofErr w:type="spellEnd"/>
+      <w:r>
+        <w:t xml:space="preserve"> </w:t>
+      </w:r>
+      <w:proofErr w:type="spellStart"/>
+      <w:r>
+        <w:t>ra</w:t>
+      </w:r>
+      <w:proofErr w:type="spellEnd"/>
+      <w:r>
+        <w:t xml:space="preserve"> </w:t>
+      </w:r>
+      <w:proofErr w:type="spellStart"/>
+      <w:r>
+        <w:t>quyết</w:t>
+      </w:r>
+      <w:proofErr w:type="spellEnd"/>
+      <w:r>
+        <w:t xml:space="preserve"> </w:t>
+      </w:r>
+      <w:proofErr w:type="spellStart"/>
+      <w:r>
+        <w:t>định</w:t>
+      </w:r>
+      <w:proofErr w:type="spellEnd"/>
       <w:r>
         <w:br/>
-        <w:t>■ Informed: Người được</w:t>
-      </w:r>
-      <w:r>
-        <w:t xml:space="preserve"> </w:t>
-      </w:r>
-      <w:r>
-        <w:t>thông báo về quyết định</w:t>
-      </w:r>
+        <w:t xml:space="preserve">■ Informed: </w:t>
+      </w:r>
+      <w:proofErr w:type="spellStart"/>
+      <w:r>
+        <w:t>Người</w:t>
+      </w:r>
+      <w:proofErr w:type="spellEnd"/>
+      <w:r>
+        <w:t xml:space="preserve"> </w:t>
+      </w:r>
+      <w:proofErr w:type="spellStart"/>
+      <w:r>
+        <w:t>được</w:t>
+      </w:r>
+      <w:proofErr w:type="spellEnd"/>
+      <w:r>
+        <w:t xml:space="preserve"> </w:t>
+      </w:r>
+      <w:proofErr w:type="spellStart"/>
+      <w:r>
+        <w:t>thông</w:t>
+      </w:r>
+      <w:proofErr w:type="spellEnd"/>
+      <w:r>
+        <w:t xml:space="preserve"> </w:t>
+      </w:r>
+      <w:proofErr w:type="spellStart"/>
+      <w:r>
+        <w:t>báo</w:t>
+      </w:r>
+      <w:proofErr w:type="spellEnd"/>
+      <w:r>
+        <w:t xml:space="preserve"> </w:t>
+      </w:r>
+      <w:proofErr w:type="spellStart"/>
+      <w:r>
+        <w:t>về</w:t>
+      </w:r>
+      <w:proofErr w:type="spellEnd"/>
+      <w:r>
+        <w:t xml:space="preserve"> </w:t>
+      </w:r>
+      <w:proofErr w:type="spellStart"/>
+      <w:r>
+        <w:t>quyết</w:t>
+      </w:r>
+      <w:proofErr w:type="spellEnd"/>
+      <w:r>
+        <w:t xml:space="preserve"> </w:t>
+      </w:r>
+      <w:proofErr w:type="spellStart"/>
+      <w:r>
+        <w:t>định</w:t>
+      </w:r>
+      <w:proofErr w:type="spellEnd"/>
       <w:r>
         <w:br/>
-        <w:t>■ Support: Người hỗ trợ quá</w:t>
-      </w:r>
-      <w:r>
-        <w:t xml:space="preserve"> </w:t>
-      </w:r>
-      <w:r>
-        <w:t>trình hoàn thành công việc</w:t>
-      </w:r>
+        <w:t xml:space="preserve">■ Support: </w:t>
+      </w:r>
+      <w:proofErr w:type="spellStart"/>
+      <w:r>
+        <w:t>Người</w:t>
+      </w:r>
+      <w:proofErr w:type="spellEnd"/>
+      <w:r>
+        <w:t xml:space="preserve"> </w:t>
+      </w:r>
+      <w:proofErr w:type="spellStart"/>
+      <w:r>
+        <w:t>hỗ</w:t>
+      </w:r>
+      <w:proofErr w:type="spellEnd"/>
+      <w:r>
+        <w:t xml:space="preserve"> </w:t>
+      </w:r>
+      <w:proofErr w:type="spellStart"/>
+      <w:r>
+        <w:t>trợ</w:t>
+      </w:r>
+      <w:proofErr w:type="spellEnd"/>
+      <w:r>
+        <w:t xml:space="preserve"> </w:t>
+      </w:r>
+      <w:proofErr w:type="spellStart"/>
+      <w:r>
+        <w:t>quá</w:t>
+      </w:r>
+      <w:proofErr w:type="spellEnd"/>
+      <w:r>
+        <w:t xml:space="preserve"> </w:t>
+      </w:r>
+      <w:proofErr w:type="spellStart"/>
+      <w:r>
+        <w:t>trình</w:t>
+      </w:r>
+      <w:proofErr w:type="spellEnd"/>
+      <w:r>
+        <w:t xml:space="preserve"> </w:t>
+      </w:r>
+      <w:proofErr w:type="spellStart"/>
+      <w:r>
+        <w:t>hoàn</w:t>
+      </w:r>
+      <w:proofErr w:type="spellEnd"/>
+      <w:r>
+        <w:t xml:space="preserve"> </w:t>
+      </w:r>
+      <w:proofErr w:type="spellStart"/>
+      <w:r>
+        <w:t>thành</w:t>
+      </w:r>
+      <w:proofErr w:type="spellEnd"/>
+      <w:r>
+        <w:t xml:space="preserve"> </w:t>
+      </w:r>
+      <w:proofErr w:type="spellStart"/>
+      <w:r>
+        <w:t>công</w:t>
+      </w:r>
+      <w:proofErr w:type="spellEnd"/>
+      <w:r>
+        <w:t xml:space="preserve"> </w:t>
+      </w:r>
+      <w:proofErr w:type="spellStart"/>
+      <w:r>
+        <w:t>việc</w:t>
+      </w:r>
+      <w:proofErr w:type="spellEnd"/>
     </w:p>
     <w:p/>
     <w:p/>
     <w:p/>
     <w:p/>
     <w:p>
-      <w:r>
-        <w:t>Phần 1.8 làm thêm 1 bảng từng chức năng cần những rule gì , 1 bên chức năng, 1 bên rule</w:t>
+      <w:proofErr w:type="spellStart"/>
+      <w:r>
+        <w:t>Phần</w:t>
+      </w:r>
+      <w:proofErr w:type="spellEnd"/>
+      <w:r>
+        <w:t xml:space="preserve"> 1.8 </w:t>
+      </w:r>
+      <w:proofErr w:type="spellStart"/>
+      <w:r>
+        <w:t>làm</w:t>
+      </w:r>
+      <w:proofErr w:type="spellEnd"/>
+      <w:r>
+        <w:t xml:space="preserve"> </w:t>
+      </w:r>
+      <w:proofErr w:type="spellStart"/>
+      <w:r>
+        <w:t>thêm</w:t>
+      </w:r>
+      <w:proofErr w:type="spellEnd"/>
+      <w:r>
+        <w:t xml:space="preserve"> 1 </w:t>
+      </w:r>
+      <w:proofErr w:type="spellStart"/>
+      <w:r>
+        <w:t>bảng</w:t>
+      </w:r>
+      <w:proofErr w:type="spellEnd"/>
+      <w:r>
+        <w:t xml:space="preserve"> </w:t>
+      </w:r>
+      <w:proofErr w:type="spellStart"/>
+      <w:r>
+        <w:t>từng</w:t>
+      </w:r>
+      <w:proofErr w:type="spellEnd"/>
+      <w:r>
+        <w:t xml:space="preserve"> </w:t>
+      </w:r>
+      <w:proofErr w:type="spellStart"/>
+      <w:r>
+        <w:t>chức</w:t>
+      </w:r>
+      <w:proofErr w:type="spellEnd"/>
+      <w:r>
+        <w:t xml:space="preserve"> </w:t>
+      </w:r>
+      <w:proofErr w:type="spellStart"/>
+      <w:r>
+        <w:t>năng</w:t>
+      </w:r>
+      <w:proofErr w:type="spellEnd"/>
+      <w:r>
+        <w:t xml:space="preserve"> </w:t>
+      </w:r>
+      <w:proofErr w:type="spellStart"/>
+      <w:r>
+        <w:t>cần</w:t>
+      </w:r>
+      <w:proofErr w:type="spellEnd"/>
+      <w:r>
+        <w:t xml:space="preserve"> </w:t>
+      </w:r>
+      <w:proofErr w:type="spellStart"/>
+      <w:r>
+        <w:t>những</w:t>
+      </w:r>
+      <w:proofErr w:type="spellEnd"/>
+      <w:r>
+        <w:t xml:space="preserve"> rule </w:t>
+      </w:r>
+      <w:proofErr w:type="spellStart"/>
+      <w:r>
+        <w:t>gì</w:t>
+      </w:r>
+      <w:proofErr w:type="spellEnd"/>
+      <w:r>
+        <w:t xml:space="preserve"> , 1 </w:t>
+      </w:r>
+      <w:proofErr w:type="spellStart"/>
+      <w:r>
+        <w:t>bên</w:t>
+      </w:r>
+      <w:proofErr w:type="spellEnd"/>
+      <w:r>
+        <w:t xml:space="preserve"> </w:t>
+      </w:r>
+      <w:proofErr w:type="spellStart"/>
+      <w:r>
+        <w:t>chức</w:t>
+      </w:r>
+      <w:proofErr w:type="spellEnd"/>
+      <w:r>
+        <w:t xml:space="preserve"> </w:t>
+      </w:r>
+      <w:proofErr w:type="spellStart"/>
+      <w:r>
+        <w:t>năng</w:t>
+      </w:r>
+      <w:proofErr w:type="spellEnd"/>
+      <w:r>
+        <w:t xml:space="preserve">, 1 </w:t>
+      </w:r>
+      <w:proofErr w:type="spellStart"/>
+      <w:r>
+        <w:t>bên</w:t>
+      </w:r>
+      <w:proofErr w:type="spellEnd"/>
+      <w:r>
+        <w:t xml:space="preserve"> rule</w:t>
       </w:r>
     </w:p>
     <w:p>
@@ -1546,17 +3272,141 @@
       </w:r>
     </w:p>
     <w:p>
-      <w:r>
-        <w:t>ktra giữa kỹ</w:t>
-      </w:r>
-      <w:r>
-        <w:t>: Chương 5, 12. usecase, mô tả usecase, swimland, vẽ 1 giao diện</w:t>
-      </w:r>
+      <w:proofErr w:type="spellStart"/>
+      <w:r>
+        <w:t>ktra</w:t>
+      </w:r>
+      <w:proofErr w:type="spellEnd"/>
+      <w:r>
+        <w:t xml:space="preserve"> </w:t>
+      </w:r>
+      <w:proofErr w:type="spellStart"/>
+      <w:r>
+        <w:t>giữa</w:t>
+      </w:r>
+      <w:proofErr w:type="spellEnd"/>
+      <w:r>
+        <w:t xml:space="preserve"> </w:t>
+      </w:r>
+      <w:proofErr w:type="spellStart"/>
+      <w:r>
+        <w:t>kỹ</w:t>
+      </w:r>
+      <w:proofErr w:type="spellEnd"/>
+      <w:r>
+        <w:t xml:space="preserve">: </w:t>
+      </w:r>
+      <w:proofErr w:type="spellStart"/>
+      <w:r>
+        <w:t>Chương</w:t>
+      </w:r>
+      <w:proofErr w:type="spellEnd"/>
+      <w:r>
+        <w:t xml:space="preserve"> 5, 12. </w:t>
+      </w:r>
+      <w:proofErr w:type="spellStart"/>
+      <w:r>
+        <w:t>usecase</w:t>
+      </w:r>
+      <w:proofErr w:type="spellEnd"/>
+      <w:r>
+        <w:t xml:space="preserve">, </w:t>
+      </w:r>
+      <w:proofErr w:type="spellStart"/>
+      <w:r>
+        <w:t>mô</w:t>
+      </w:r>
+      <w:proofErr w:type="spellEnd"/>
+      <w:r>
+        <w:t xml:space="preserve"> </w:t>
+      </w:r>
+      <w:proofErr w:type="spellStart"/>
+      <w:r>
+        <w:t>tả</w:t>
+      </w:r>
+      <w:proofErr w:type="spellEnd"/>
+      <w:r>
+        <w:t xml:space="preserve"> </w:t>
+      </w:r>
+      <w:proofErr w:type="spellStart"/>
+      <w:r>
+        <w:t>usecase</w:t>
+      </w:r>
+      <w:proofErr w:type="spellEnd"/>
+      <w:r>
+        <w:t xml:space="preserve">, </w:t>
+      </w:r>
+      <w:proofErr w:type="spellStart"/>
+      <w:r>
+        <w:t>swimland</w:t>
+      </w:r>
+      <w:proofErr w:type="spellEnd"/>
+      <w:r>
+        <w:t xml:space="preserve">, </w:t>
+      </w:r>
+      <w:proofErr w:type="spellStart"/>
+      <w:r>
+        <w:t>vẽ</w:t>
+      </w:r>
+      <w:proofErr w:type="spellEnd"/>
+      <w:r>
+        <w:t xml:space="preserve"> 1 </w:t>
+      </w:r>
+      <w:proofErr w:type="spellStart"/>
+      <w:r>
+        <w:t>giao</w:t>
+      </w:r>
+      <w:proofErr w:type="spellEnd"/>
+      <w:r>
+        <w:t xml:space="preserve"> </w:t>
+      </w:r>
+      <w:proofErr w:type="spellStart"/>
+      <w:r>
+        <w:t>diện</w:t>
+      </w:r>
+      <w:proofErr w:type="spellEnd"/>
     </w:p>
     <w:p>
       <w:r>
-        <w:t>mỗi người 6 cái prototype trong figma</w:t>
-      </w:r>
+        <w:t xml:space="preserve">BTL: </w:t>
+      </w:r>
+      <w:proofErr w:type="spellStart"/>
+      <w:r>
+        <w:t>mỗi</w:t>
+      </w:r>
+      <w:proofErr w:type="spellEnd"/>
+      <w:r>
+        <w:t xml:space="preserve"> </w:t>
+      </w:r>
+      <w:proofErr w:type="spellStart"/>
+      <w:r>
+        <w:t>người</w:t>
+      </w:r>
+      <w:proofErr w:type="spellEnd"/>
+      <w:r>
+        <w:t xml:space="preserve"> 6 </w:t>
+      </w:r>
+      <w:proofErr w:type="spellStart"/>
+      <w:r>
+        <w:t>cái</w:t>
+      </w:r>
+      <w:proofErr w:type="spellEnd"/>
+      <w:r>
+        <w:t xml:space="preserve"> prototype </w:t>
+      </w:r>
+      <w:proofErr w:type="spellStart"/>
+      <w:r>
+        <w:t>trong</w:t>
+      </w:r>
+      <w:proofErr w:type="spellEnd"/>
+      <w:r>
+        <w:t xml:space="preserve"> </w:t>
+      </w:r>
+      <w:proofErr w:type="spellStart"/>
+      <w:r>
+        <w:t>figma</w:t>
+      </w:r>
+      <w:proofErr w:type="spellEnd"/>
     </w:p>
     <w:sectPr>
       <w:pgSz w:w="12240" w:h="15840"/>

</xml_diff>

<commit_message>
Làm ppt thuyết trình
</commit_message>
<xml_diff>
--- a/Documents/Note.docx
+++ b/Documents/Note.docx
@@ -811,17 +811,8 @@
           <w:i/>
           <w:iCs/>
         </w:rPr>
-        <w:t xml:space="preserve"> </w:t>
-      </w:r>
-      <w:proofErr w:type="spellStart"/>
-      <w:r>
-        <w:rPr>
-          <w:i/>
-          <w:iCs/>
-        </w:rPr>
-        <w:t>lý</w:t>
-      </w:r>
-      <w:proofErr w:type="spellEnd"/>
+        <w:t xml:space="preserve"> lý</w:t>
+      </w:r>
       <w:r>
         <w:br/>
         <w:t>4. Solution:</w:t>
@@ -3270,101 +3261,6 @@
       <w:r>
         <w:t>PearlsFromSand.com SRS Example</w:t>
       </w:r>
-    </w:p>
-    <w:p>
-      <w:proofErr w:type="spellStart"/>
-      <w:r>
-        <w:t>ktra</w:t>
-      </w:r>
-      <w:proofErr w:type="spellEnd"/>
-      <w:r>
-        <w:t xml:space="preserve"> </w:t>
-      </w:r>
-      <w:proofErr w:type="spellStart"/>
-      <w:r>
-        <w:t>giữa</w:t>
-      </w:r>
-      <w:proofErr w:type="spellEnd"/>
-      <w:r>
-        <w:t xml:space="preserve"> </w:t>
-      </w:r>
-      <w:proofErr w:type="spellStart"/>
-      <w:r>
-        <w:t>kỹ</w:t>
-      </w:r>
-      <w:proofErr w:type="spellEnd"/>
-      <w:r>
-        <w:t xml:space="preserve">: </w:t>
-      </w:r>
-      <w:proofErr w:type="spellStart"/>
-      <w:r>
-        <w:t>Chương</w:t>
-      </w:r>
-      <w:proofErr w:type="spellEnd"/>
-      <w:r>
-        <w:t xml:space="preserve"> 5, 12. </w:t>
-      </w:r>
-      <w:proofErr w:type="spellStart"/>
-      <w:r>
-        <w:t>usecase</w:t>
-      </w:r>
-      <w:proofErr w:type="spellEnd"/>
-      <w:r>
-        <w:t xml:space="preserve">, </w:t>
-      </w:r>
-      <w:proofErr w:type="spellStart"/>
-      <w:r>
-        <w:t>mô</w:t>
-      </w:r>
-      <w:proofErr w:type="spellEnd"/>
-      <w:r>
-        <w:t xml:space="preserve"> </w:t>
-      </w:r>
-      <w:proofErr w:type="spellStart"/>
-      <w:r>
-        <w:t>tả</w:t>
-      </w:r>
-      <w:proofErr w:type="spellEnd"/>
-      <w:r>
-        <w:t xml:space="preserve"> </w:t>
-      </w:r>
-      <w:proofErr w:type="spellStart"/>
-      <w:r>
-        <w:t>usecase</w:t>
-      </w:r>
-      <w:proofErr w:type="spellEnd"/>
-      <w:r>
-        <w:t xml:space="preserve">, </w:t>
-      </w:r>
-      <w:proofErr w:type="spellStart"/>
-      <w:r>
-        <w:t>swimland</w:t>
-      </w:r>
-      <w:proofErr w:type="spellEnd"/>
-      <w:r>
-        <w:t xml:space="preserve">, </w:t>
-      </w:r>
-      <w:proofErr w:type="spellStart"/>
-      <w:r>
-        <w:t>vẽ</w:t>
-      </w:r>
-      <w:proofErr w:type="spellEnd"/>
-      <w:r>
-        <w:t xml:space="preserve"> 1 </w:t>
-      </w:r>
-      <w:proofErr w:type="spellStart"/>
-      <w:r>
-        <w:t>giao</w:t>
-      </w:r>
-      <w:proofErr w:type="spellEnd"/>
-      <w:r>
-        <w:t xml:space="preserve"> </w:t>
-      </w:r>
-      <w:proofErr w:type="spellStart"/>
-      <w:r>
-        <w:t>diện</w:t>
-      </w:r>
-      <w:proofErr w:type="spellEnd"/>
     </w:p>
     <w:p>
       <w:r>

</xml_diff>

<commit_message>
Sửa lại phân tích BTL
</commit_message>
<xml_diff>
--- a/Documents/Note.docx
+++ b/Documents/Note.docx
@@ -3,53 +3,14 @@
 <w:document xmlns:wpc="http://schemas.microsoft.com/office/word/2010/wordprocessingCanvas" xmlns:cx="http://schemas.microsoft.com/office/drawing/2014/chartex" xmlns:cx1="http://schemas.microsoft.com/office/drawing/2015/9/8/chartex" xmlns:cx2="http://schemas.microsoft.com/office/drawing/2015/10/21/chartex" xmlns:cx3="http://schemas.microsoft.com/office/drawing/2016/5/9/chartex" xmlns:cx4="http://schemas.microsoft.com/office/drawing/2016/5/10/chartex" xmlns:cx5="http://schemas.microsoft.com/office/drawing/2016/5/11/chartex" xmlns:cx6="http://schemas.microsoft.com/office/drawing/2016/5/12/chartex" xmlns:cx7="http://schemas.microsoft.com/office/drawing/2016/5/13/chartex" xmlns:cx8="http://schemas.microsoft.com/office/drawing/2016/5/14/chartex" xmlns:mc="http://schemas.openxmlformats.org/markup-compatibility/2006" xmlns:aink="http://schemas.microsoft.com/office/drawing/2016/ink" xmlns:am3d="http://schemas.microsoft.com/office/drawing/2017/model3d" xmlns:o="urn:schemas-microsoft-com:office:office" xmlns:oel="http://schemas.microsoft.com/office/2019/extlst" xmlns:r="http://schemas.openxmlformats.org/officeDocument/2006/relationships" xmlns:m="http://schemas.openxmlformats.org/officeDocument/2006/math" xmlns:v="urn:schemas-microsoft-com:vml" xmlns:wp14="http://schemas.microsoft.com/office/word/2010/wordprocessingDrawing" xmlns:wp="http://schemas.openxmlformats.org/drawingml/2006/wordprocessingDrawing" xmlns:w10="urn:schemas-microsoft-com:office:word" xmlns:w="http://schemas.openxmlformats.org/wordprocessingml/2006/main" xmlns:w14="http://schemas.microsoft.com/office/word/2010/wordml" xmlns:w15="http://schemas.microsoft.com/office/word/2012/wordml" xmlns:w16cex="http://schemas.microsoft.com/office/word/2018/wordml/cex" xmlns:w16cid="http://schemas.microsoft.com/office/word/2016/wordml/cid" xmlns:w16="http://schemas.microsoft.com/office/word/2018/wordml" xmlns:w16du="http://schemas.microsoft.com/office/word/2023/wordml/word16du" xmlns:w16sdtdh="http://schemas.microsoft.com/office/word/2020/wordml/sdtdatahash" xmlns:w16sdtfl="http://schemas.microsoft.com/office/word/2024/wordml/sdtformatlock" xmlns:w16se="http://schemas.microsoft.com/office/word/2015/wordml/symex" xmlns:wpg="http://schemas.microsoft.com/office/word/2010/wordprocessingGroup" xmlns:wpi="http://schemas.microsoft.com/office/word/2010/wordprocessingInk" xmlns:wne="http://schemas.microsoft.com/office/word/2006/wordml" xmlns:wps="http://schemas.microsoft.com/office/word/2010/wordprocessingShape" mc:Ignorable="w14 w15 w16se w16cid w16 w16cex w16sdtdh w16sdtfl w16du wp14">
   <w:body>
     <w:p>
-      <w:proofErr w:type="spellStart"/>
-      <w:r>
-        <w:t>Phần</w:t>
-      </w:r>
-      <w:proofErr w:type="spellEnd"/>
-      <w:r>
-        <w:t xml:space="preserve"> </w:t>
-      </w:r>
-      <w:proofErr w:type="spellStart"/>
-      <w:r>
-        <w:t>mềm</w:t>
-      </w:r>
-      <w:proofErr w:type="spellEnd"/>
-      <w:r>
-        <w:t xml:space="preserve"> </w:t>
-      </w:r>
-      <w:proofErr w:type="spellStart"/>
-      <w:r>
-        <w:t>chấm</w:t>
-      </w:r>
-      <w:proofErr w:type="spellEnd"/>
-      <w:r>
-        <w:t xml:space="preserve"> </w:t>
-      </w:r>
-      <w:proofErr w:type="spellStart"/>
-      <w:r>
-        <w:t>công</w:t>
-      </w:r>
-      <w:proofErr w:type="spellEnd"/>
+      <w:r>
+        <w:t>Phần mềm chấm công</w:t>
+      </w:r>
     </w:p>
     <w:p/>
     <w:p>
-      <w:proofErr w:type="spellStart"/>
-      <w:r>
-        <w:t>Khái</w:t>
-      </w:r>
-      <w:proofErr w:type="spellEnd"/>
-      <w:r>
-        <w:t xml:space="preserve"> </w:t>
-      </w:r>
-      <w:proofErr w:type="spellStart"/>
-      <w:r>
-        <w:t>quát</w:t>
-      </w:r>
-      <w:proofErr w:type="spellEnd"/>
-      <w:r>
-        <w:t xml:space="preserve">: </w:t>
+      <w:r>
+        <w:t xml:space="preserve">Khái quát: </w:t>
       </w:r>
     </w:p>
     <w:p>
@@ -60,194 +21,23 @@
           <w:numId w:val="1"/>
         </w:numPr>
       </w:pPr>
-      <w:proofErr w:type="spellStart"/>
-      <w:r>
-        <w:t>Ghi</w:t>
-      </w:r>
-      <w:proofErr w:type="spellEnd"/>
-      <w:r>
-        <w:t xml:space="preserve"> </w:t>
-      </w:r>
-      <w:proofErr w:type="spellStart"/>
-      <w:r>
-        <w:t>nhận</w:t>
-      </w:r>
-      <w:proofErr w:type="spellEnd"/>
-      <w:r>
-        <w:t xml:space="preserve"> </w:t>
-      </w:r>
-      <w:proofErr w:type="spellStart"/>
-      <w:r>
-        <w:t>giờ</w:t>
-      </w:r>
-      <w:proofErr w:type="spellEnd"/>
-      <w:r>
-        <w:t xml:space="preserve"> </w:t>
-      </w:r>
-      <w:proofErr w:type="spellStart"/>
-      <w:r>
-        <w:t>đi</w:t>
-      </w:r>
-      <w:proofErr w:type="spellEnd"/>
-      <w:r>
-        <w:t xml:space="preserve"> </w:t>
-      </w:r>
-      <w:proofErr w:type="spellStart"/>
-      <w:r>
-        <w:t>làm</w:t>
-      </w:r>
-      <w:proofErr w:type="spellEnd"/>
-      <w:r>
-        <w:t xml:space="preserve"> </w:t>
-      </w:r>
-      <w:proofErr w:type="spellStart"/>
-      <w:r>
-        <w:t>của</w:t>
-      </w:r>
-      <w:proofErr w:type="spellEnd"/>
-      <w:r>
-        <w:t xml:space="preserve"> </w:t>
-      </w:r>
-      <w:proofErr w:type="spellStart"/>
-      <w:r>
-        <w:t>nhân</w:t>
-      </w:r>
-      <w:proofErr w:type="spellEnd"/>
-      <w:r>
-        <w:t xml:space="preserve"> </w:t>
-      </w:r>
-      <w:proofErr w:type="spellStart"/>
-      <w:r>
-        <w:t>viên</w:t>
-      </w:r>
-      <w:proofErr w:type="spellEnd"/>
+      <w:r>
+        <w:t xml:space="preserve">Ghi nhận giờ </w:t>
+      </w:r>
+      <w:r>
+        <w:t>đi làm của nhân viên</w:t>
+      </w:r>
     </w:p>
     <w:p/>
     <w:p>
-      <w:proofErr w:type="spellStart"/>
-      <w:r>
-        <w:t>Cụ</w:t>
-      </w:r>
-      <w:proofErr w:type="spellEnd"/>
-      <w:r>
-        <w:t xml:space="preserve"> </w:t>
-      </w:r>
-      <w:proofErr w:type="spellStart"/>
-      <w:r>
-        <w:t>thể</w:t>
-      </w:r>
-      <w:proofErr w:type="spellEnd"/>
-    </w:p>
-    <w:p>
-      <w:proofErr w:type="spellStart"/>
-      <w:r>
-        <w:t>Chấm</w:t>
-      </w:r>
-      <w:proofErr w:type="spellEnd"/>
-      <w:r>
-        <w:t xml:space="preserve"> </w:t>
-      </w:r>
-      <w:proofErr w:type="spellStart"/>
-      <w:r>
-        <w:t>công</w:t>
-      </w:r>
-      <w:proofErr w:type="spellEnd"/>
-      <w:r>
-        <w:t xml:space="preserve"> </w:t>
-      </w:r>
-      <w:proofErr w:type="spellStart"/>
-      <w:r>
-        <w:t>bằng</w:t>
-      </w:r>
-      <w:proofErr w:type="spellEnd"/>
-      <w:r>
-        <w:t xml:space="preserve"> </w:t>
-      </w:r>
-      <w:proofErr w:type="spellStart"/>
-      <w:r>
-        <w:t>thẻ</w:t>
-      </w:r>
-      <w:proofErr w:type="spellEnd"/>
-      <w:r>
-        <w:t xml:space="preserve">, </w:t>
-      </w:r>
-      <w:proofErr w:type="spellStart"/>
-      <w:r>
-        <w:t>bằng</w:t>
-      </w:r>
-      <w:proofErr w:type="spellEnd"/>
-      <w:r>
-        <w:t xml:space="preserve"> </w:t>
-      </w:r>
-      <w:proofErr w:type="spellStart"/>
-      <w:r>
-        <w:t>vân</w:t>
-      </w:r>
-      <w:proofErr w:type="spellEnd"/>
-      <w:r>
-        <w:t xml:space="preserve"> </w:t>
-      </w:r>
-      <w:proofErr w:type="spellStart"/>
-      <w:r>
-        <w:t>tay</w:t>
-      </w:r>
-      <w:proofErr w:type="spellEnd"/>
-      <w:r>
-        <w:t xml:space="preserve">, </w:t>
-      </w:r>
-      <w:proofErr w:type="spellStart"/>
-      <w:r>
-        <w:t>khuôn</w:t>
-      </w:r>
-      <w:proofErr w:type="spellEnd"/>
-      <w:r>
-        <w:t xml:space="preserve"> </w:t>
-      </w:r>
-      <w:proofErr w:type="spellStart"/>
-      <w:r>
-        <w:t>mặt</w:t>
-      </w:r>
-      <w:proofErr w:type="spellEnd"/>
-      <w:r>
-        <w:t xml:space="preserve">. </w:t>
-      </w:r>
-      <w:proofErr w:type="spellStart"/>
-      <w:r>
-        <w:t>chấm</w:t>
-      </w:r>
-      <w:proofErr w:type="spellEnd"/>
-      <w:r>
-        <w:t xml:space="preserve"> </w:t>
-      </w:r>
-      <w:proofErr w:type="spellStart"/>
-      <w:r>
-        <w:t>công</w:t>
-      </w:r>
-      <w:proofErr w:type="spellEnd"/>
-      <w:r>
-        <w:t xml:space="preserve"> </w:t>
-      </w:r>
-      <w:proofErr w:type="spellStart"/>
-      <w:r>
-        <w:t>để</w:t>
-      </w:r>
-      <w:proofErr w:type="spellEnd"/>
-      <w:r>
-        <w:t xml:space="preserve"> </w:t>
-      </w:r>
-      <w:proofErr w:type="spellStart"/>
-      <w:r>
-        <w:t>tính</w:t>
-      </w:r>
-      <w:proofErr w:type="spellEnd"/>
-      <w:r>
-        <w:t xml:space="preserve"> </w:t>
-      </w:r>
-      <w:proofErr w:type="spellStart"/>
-      <w:r>
-        <w:t>lương</w:t>
-      </w:r>
-      <w:proofErr w:type="spellEnd"/>
+      <w:r>
+        <w:t>Cụ thể</w:t>
+      </w:r>
+    </w:p>
+    <w:p>
+      <w:r>
+        <w:t>Chấm công bằng thẻ, bằng vân tay, khuôn mặt. chấm công để tính lương</w:t>
+      </w:r>
     </w:p>
     <w:p>
       <w:pPr>
@@ -258,29 +48,8 @@
         </w:numPr>
       </w:pPr>
       <w:r>
-        <w:t xml:space="preserve">Quản </w:t>
-      </w:r>
-      <w:proofErr w:type="spellStart"/>
-      <w:r>
-        <w:t>lý</w:t>
-      </w:r>
-      <w:proofErr w:type="spellEnd"/>
-      <w:r>
-        <w:t xml:space="preserve"> </w:t>
-      </w:r>
-      <w:proofErr w:type="spellStart"/>
-      <w:r>
-        <w:t>nhân</w:t>
-      </w:r>
-      <w:proofErr w:type="spellEnd"/>
-      <w:r>
-        <w:t xml:space="preserve"> </w:t>
-      </w:r>
-      <w:proofErr w:type="spellStart"/>
-      <w:r>
-        <w:t>viên</w:t>
-      </w:r>
-      <w:proofErr w:type="spellEnd"/>
+        <w:t>Quản lý nhân viên</w:t>
+      </w:r>
     </w:p>
     <w:p>
       <w:pPr>
@@ -290,13 +59,8 @@
           <w:numId w:val="3"/>
         </w:numPr>
       </w:pPr>
-      <w:proofErr w:type="spellStart"/>
-      <w:r>
-        <w:t>Thêm</w:t>
-      </w:r>
-      <w:proofErr w:type="spellEnd"/>
-      <w:r>
-        <w:t xml:space="preserve"> </w:t>
+      <w:r>
+        <w:t xml:space="preserve">Thêm </w:t>
       </w:r>
     </w:p>
     <w:p>
@@ -307,11 +71,9 @@
           <w:numId w:val="3"/>
         </w:numPr>
       </w:pPr>
-      <w:proofErr w:type="spellStart"/>
       <w:r>
         <w:t>Sửa</w:t>
       </w:r>
-      <w:proofErr w:type="spellEnd"/>
     </w:p>
     <w:p>
       <w:pPr>
@@ -321,11 +83,9 @@
           <w:numId w:val="3"/>
         </w:numPr>
       </w:pPr>
-      <w:proofErr w:type="spellStart"/>
       <w:r>
         <w:t>Xoá</w:t>
       </w:r>
-      <w:proofErr w:type="spellEnd"/>
     </w:p>
     <w:p>
       <w:pPr>
@@ -335,19 +95,9 @@
           <w:numId w:val="2"/>
         </w:numPr>
       </w:pPr>
-      <w:proofErr w:type="spellStart"/>
-      <w:r>
-        <w:t>Chấm</w:t>
-      </w:r>
-      <w:proofErr w:type="spellEnd"/>
-      <w:r>
-        <w:t xml:space="preserve"> </w:t>
-      </w:r>
-      <w:proofErr w:type="spellStart"/>
-      <w:r>
-        <w:t>công</w:t>
-      </w:r>
-      <w:proofErr w:type="spellEnd"/>
+      <w:r>
+        <w:t>Chấm công</w:t>
+      </w:r>
     </w:p>
     <w:p>
       <w:pPr>
@@ -382,29 +132,8 @@
         </w:numPr>
       </w:pPr>
       <w:r>
-        <w:t xml:space="preserve">Quản </w:t>
-      </w:r>
-      <w:proofErr w:type="spellStart"/>
-      <w:r>
-        <w:t>lý</w:t>
-      </w:r>
-      <w:proofErr w:type="spellEnd"/>
-      <w:r>
-        <w:t xml:space="preserve"> ca </w:t>
-      </w:r>
-      <w:proofErr w:type="spellStart"/>
-      <w:r>
-        <w:t>làm</w:t>
-      </w:r>
-      <w:proofErr w:type="spellEnd"/>
-      <w:r>
-        <w:t xml:space="preserve"> </w:t>
-      </w:r>
-      <w:proofErr w:type="spellStart"/>
-      <w:r>
-        <w:t>việc</w:t>
-      </w:r>
-      <w:proofErr w:type="spellEnd"/>
+        <w:t>Quản lý ca làm việc</w:t>
+      </w:r>
     </w:p>
     <w:p>
       <w:pPr>
@@ -414,19 +143,9 @@
           <w:numId w:val="3"/>
         </w:numPr>
       </w:pPr>
-      <w:proofErr w:type="spellStart"/>
-      <w:r>
-        <w:t>Tạo</w:t>
-      </w:r>
-      <w:proofErr w:type="spellEnd"/>
-      <w:r>
-        <w:t xml:space="preserve"> ca </w:t>
-      </w:r>
-      <w:proofErr w:type="spellStart"/>
-      <w:r>
-        <w:t>làm</w:t>
-      </w:r>
-      <w:proofErr w:type="spellEnd"/>
+      <w:r>
+        <w:t>Tạo ca làm</w:t>
+      </w:r>
     </w:p>
     <w:p>
       <w:pPr>
@@ -436,51 +155,9 @@
           <w:numId w:val="3"/>
         </w:numPr>
       </w:pPr>
-      <w:proofErr w:type="spellStart"/>
-      <w:r>
-        <w:t>Gán</w:t>
-      </w:r>
-      <w:proofErr w:type="spellEnd"/>
-      <w:r>
-        <w:t xml:space="preserve"> ca </w:t>
-      </w:r>
-      <w:proofErr w:type="spellStart"/>
-      <w:r>
-        <w:t>làm</w:t>
-      </w:r>
-      <w:proofErr w:type="spellEnd"/>
-      <w:r>
-        <w:t xml:space="preserve"> </w:t>
-      </w:r>
-      <w:proofErr w:type="spellStart"/>
-      <w:r>
-        <w:t>việc</w:t>
-      </w:r>
-      <w:proofErr w:type="spellEnd"/>
-      <w:r>
-        <w:t xml:space="preserve"> </w:t>
-      </w:r>
-      <w:proofErr w:type="spellStart"/>
-      <w:r>
-        <w:t>cho</w:t>
-      </w:r>
-      <w:proofErr w:type="spellEnd"/>
-      <w:r>
-        <w:t xml:space="preserve"> </w:t>
-      </w:r>
-      <w:proofErr w:type="spellStart"/>
-      <w:r>
-        <w:t>nhân</w:t>
-      </w:r>
-      <w:proofErr w:type="spellEnd"/>
-      <w:r>
-        <w:t xml:space="preserve"> </w:t>
-      </w:r>
-      <w:proofErr w:type="spellStart"/>
-      <w:r>
-        <w:t>viên</w:t>
-      </w:r>
-      <w:proofErr w:type="spellEnd"/>
+      <w:r>
+        <w:t>Gán ca làm việc cho nhân viên</w:t>
+      </w:r>
     </w:p>
     <w:p>
       <w:pPr>
@@ -490,35 +167,9 @@
           <w:numId w:val="2"/>
         </w:numPr>
       </w:pPr>
-      <w:proofErr w:type="spellStart"/>
-      <w:r>
-        <w:t>Tính</w:t>
-      </w:r>
-      <w:proofErr w:type="spellEnd"/>
-      <w:r>
-        <w:t xml:space="preserve"> </w:t>
-      </w:r>
-      <w:proofErr w:type="spellStart"/>
-      <w:r>
-        <w:t>công</w:t>
-      </w:r>
-      <w:proofErr w:type="spellEnd"/>
-      <w:r>
-        <w:t xml:space="preserve">, </w:t>
-      </w:r>
-      <w:proofErr w:type="spellStart"/>
-      <w:r>
-        <w:t>tính</w:t>
-      </w:r>
-      <w:proofErr w:type="spellEnd"/>
-      <w:r>
-        <w:t xml:space="preserve"> </w:t>
-      </w:r>
-      <w:proofErr w:type="spellStart"/>
-      <w:r>
-        <w:t>lương</w:t>
-      </w:r>
-      <w:proofErr w:type="spellEnd"/>
+      <w:r>
+        <w:t>Tính công, tính lương</w:t>
+      </w:r>
     </w:p>
     <w:p>
       <w:pPr>
@@ -528,35 +179,9 @@
           <w:numId w:val="3"/>
         </w:numPr>
       </w:pPr>
-      <w:proofErr w:type="spellStart"/>
-      <w:r>
-        <w:t>Tính</w:t>
-      </w:r>
-      <w:proofErr w:type="spellEnd"/>
-      <w:r>
-        <w:t xml:space="preserve"> </w:t>
-      </w:r>
-      <w:proofErr w:type="spellStart"/>
-      <w:r>
-        <w:t>lương</w:t>
-      </w:r>
-      <w:proofErr w:type="spellEnd"/>
-      <w:r>
-        <w:t xml:space="preserve"> </w:t>
-      </w:r>
-      <w:proofErr w:type="spellStart"/>
-      <w:r>
-        <w:t>cơ</w:t>
-      </w:r>
-      <w:proofErr w:type="spellEnd"/>
-      <w:r>
-        <w:t xml:space="preserve"> </w:t>
-      </w:r>
-      <w:proofErr w:type="spellStart"/>
-      <w:r>
-        <w:t>bản</w:t>
-      </w:r>
-      <w:proofErr w:type="spellEnd"/>
+      <w:r>
+        <w:t>Tính lương cơ bản</w:t>
+      </w:r>
     </w:p>
     <w:p>
       <w:pPr>
@@ -566,13 +191,8 @@
           <w:numId w:val="3"/>
         </w:numPr>
       </w:pPr>
-      <w:proofErr w:type="spellStart"/>
-      <w:r>
-        <w:t>Thưởng</w:t>
-      </w:r>
-      <w:proofErr w:type="spellEnd"/>
-      <w:r>
-        <w:t xml:space="preserve"> </w:t>
+      <w:r>
+        <w:t xml:space="preserve">Thưởng </w:t>
       </w:r>
     </w:p>
     <w:p>
@@ -583,19 +203,9 @@
           <w:numId w:val="3"/>
         </w:numPr>
       </w:pPr>
-      <w:proofErr w:type="spellStart"/>
-      <w:r>
-        <w:t>Phụ</w:t>
-      </w:r>
-      <w:proofErr w:type="spellEnd"/>
-      <w:r>
-        <w:t xml:space="preserve"> </w:t>
-      </w:r>
-      <w:proofErr w:type="spellStart"/>
-      <w:r>
-        <w:t>cấp</w:t>
-      </w:r>
-      <w:proofErr w:type="spellEnd"/>
+      <w:r>
+        <w:t>Phụ cấp</w:t>
+      </w:r>
     </w:p>
     <w:p>
       <w:pPr>
@@ -605,27 +215,9 @@
           <w:numId w:val="3"/>
         </w:numPr>
       </w:pPr>
-      <w:proofErr w:type="spellStart"/>
-      <w:r>
-        <w:t>Đóng</w:t>
-      </w:r>
-      <w:proofErr w:type="spellEnd"/>
-      <w:r>
-        <w:t xml:space="preserve"> </w:t>
-      </w:r>
-      <w:proofErr w:type="spellStart"/>
-      <w:r>
-        <w:t>bảo</w:t>
-      </w:r>
-      <w:proofErr w:type="spellEnd"/>
-      <w:r>
-        <w:t xml:space="preserve"> </w:t>
-      </w:r>
-      <w:proofErr w:type="spellStart"/>
-      <w:r>
-        <w:t>hiểm</w:t>
-      </w:r>
-      <w:proofErr w:type="spellEnd"/>
+      <w:r>
+        <w:t>Đóng bảo hiểm</w:t>
+      </w:r>
     </w:p>
     <w:p>
       <w:pPr>
@@ -636,29 +228,8 @@
         </w:numPr>
       </w:pPr>
       <w:r>
-        <w:t xml:space="preserve">Quản </w:t>
-      </w:r>
-      <w:proofErr w:type="spellStart"/>
-      <w:r>
-        <w:t>lý</w:t>
-      </w:r>
-      <w:proofErr w:type="spellEnd"/>
-      <w:r>
-        <w:t xml:space="preserve"> </w:t>
-      </w:r>
-      <w:proofErr w:type="spellStart"/>
-      <w:r>
-        <w:t>nghỉ</w:t>
-      </w:r>
-      <w:proofErr w:type="spellEnd"/>
-      <w:r>
-        <w:t xml:space="preserve"> </w:t>
-      </w:r>
-      <w:proofErr w:type="spellStart"/>
-      <w:r>
-        <w:t>phép</w:t>
-      </w:r>
-      <w:proofErr w:type="spellEnd"/>
+        <w:t>Quản lý nghỉ phép</w:t>
+      </w:r>
     </w:p>
     <w:p/>
     <w:p/>
@@ -687,45 +258,11 @@
         <w:t>2. Stakeholder:</w:t>
       </w:r>
       <w:r>
-        <w:t xml:space="preserve"> </w:t>
-      </w:r>
-      <w:proofErr w:type="spellStart"/>
-      <w:r>
-        <w:t>Nhân</w:t>
-      </w:r>
-      <w:proofErr w:type="spellEnd"/>
-      <w:r>
-        <w:t xml:space="preserve"> </w:t>
-      </w:r>
-      <w:proofErr w:type="spellStart"/>
-      <w:r>
-        <w:t>sự</w:t>
-      </w:r>
-      <w:proofErr w:type="spellEnd"/>
-      <w:r>
-        <w:t xml:space="preserve"> </w:t>
-      </w:r>
-      <w:proofErr w:type="spellStart"/>
-      <w:r>
-        <w:t>của</w:t>
-      </w:r>
-      <w:proofErr w:type="spellEnd"/>
-      <w:r>
-        <w:t xml:space="preserve"> </w:t>
-      </w:r>
-      <w:proofErr w:type="spellStart"/>
-      <w:r>
-        <w:t>công</w:t>
-      </w:r>
-      <w:proofErr w:type="spellEnd"/>
-      <w:r>
-        <w:t xml:space="preserve"> ty, Quản </w:t>
-      </w:r>
-      <w:proofErr w:type="spellStart"/>
-      <w:r>
-        <w:t>lý</w:t>
-      </w:r>
-      <w:proofErr w:type="spellEnd"/>
+        <w:t xml:space="preserve"> Nhân sự</w:t>
+      </w:r>
+      <w:r>
+        <w:t xml:space="preserve"> của công ty, Quản lý</w:t>
+      </w:r>
       <w:r>
         <w:br/>
         <w:t>3. Needs:</w:t>
@@ -733,274 +270,34 @@
       <w:r>
         <w:t xml:space="preserve"> </w:t>
       </w:r>
-      <w:proofErr w:type="spellStart"/>
       <w:r>
         <w:rPr>
           <w:i/>
           <w:iCs/>
         </w:rPr>
-        <w:t>nâng</w:t>
-      </w:r>
-      <w:proofErr w:type="spellEnd"/>
-      <w:r>
-        <w:rPr>
-          <w:i/>
-          <w:iCs/>
-        </w:rPr>
-        <w:t xml:space="preserve"> </w:t>
-      </w:r>
-      <w:proofErr w:type="spellStart"/>
-      <w:r>
-        <w:rPr>
-          <w:i/>
-          <w:iCs/>
-        </w:rPr>
-        <w:t>cao</w:t>
-      </w:r>
-      <w:proofErr w:type="spellEnd"/>
-      <w:r>
-        <w:rPr>
-          <w:i/>
-          <w:iCs/>
-        </w:rPr>
-        <w:t xml:space="preserve"> </w:t>
-      </w:r>
-      <w:proofErr w:type="spellStart"/>
-      <w:r>
-        <w:rPr>
-          <w:i/>
-          <w:iCs/>
-        </w:rPr>
-        <w:t>chất</w:t>
-      </w:r>
-      <w:proofErr w:type="spellEnd"/>
-      <w:r>
-        <w:rPr>
-          <w:i/>
-          <w:iCs/>
-        </w:rPr>
-        <w:t xml:space="preserve"> </w:t>
-      </w:r>
-      <w:proofErr w:type="spellStart"/>
-      <w:r>
-        <w:rPr>
-          <w:i/>
-          <w:iCs/>
-        </w:rPr>
-        <w:t>lượng</w:t>
-      </w:r>
-      <w:proofErr w:type="spellEnd"/>
-      <w:r>
-        <w:rPr>
-          <w:i/>
-          <w:iCs/>
-        </w:rPr>
-        <w:t xml:space="preserve"> </w:t>
-      </w:r>
-      <w:proofErr w:type="spellStart"/>
-      <w:r>
-        <w:rPr>
-          <w:i/>
-          <w:iCs/>
-        </w:rPr>
-        <w:t>quản</w:t>
-      </w:r>
-      <w:proofErr w:type="spellEnd"/>
-      <w:r>
-        <w:rPr>
-          <w:i/>
-          <w:iCs/>
-        </w:rPr>
-        <w:t xml:space="preserve"> lý</w:t>
+        <w:t>nâng cao chất lượng quản lý</w:t>
       </w:r>
       <w:r>
         <w:br/>
         <w:t>4. Solution:</w:t>
       </w:r>
       <w:r>
-        <w:t xml:space="preserve"> </w:t>
-      </w:r>
-      <w:proofErr w:type="spellStart"/>
-      <w:r>
-        <w:t>Phần</w:t>
-      </w:r>
-      <w:proofErr w:type="spellEnd"/>
-      <w:r>
-        <w:t xml:space="preserve"> </w:t>
-      </w:r>
-      <w:proofErr w:type="spellStart"/>
-      <w:r>
-        <w:t>mềm</w:t>
-      </w:r>
-      <w:proofErr w:type="spellEnd"/>
-      <w:r>
-        <w:t xml:space="preserve"> </w:t>
-      </w:r>
-      <w:proofErr w:type="spellStart"/>
-      <w:r>
-        <w:t>quản</w:t>
-      </w:r>
-      <w:proofErr w:type="spellEnd"/>
-      <w:r>
-        <w:t xml:space="preserve"> </w:t>
-      </w:r>
-      <w:proofErr w:type="spellStart"/>
-      <w:r>
-        <w:t>lý</w:t>
-      </w:r>
-      <w:proofErr w:type="spellEnd"/>
-      <w:r>
-        <w:t xml:space="preserve"> </w:t>
-      </w:r>
-      <w:proofErr w:type="spellStart"/>
-      <w:r>
-        <w:t>nhân</w:t>
-      </w:r>
-      <w:proofErr w:type="spellEnd"/>
-      <w:r>
-        <w:t xml:space="preserve"> </w:t>
-      </w:r>
-      <w:proofErr w:type="spellStart"/>
-      <w:r>
-        <w:t>sự</w:t>
-      </w:r>
-      <w:proofErr w:type="spellEnd"/>
+        <w:t xml:space="preserve"> Phần mềm quản lý nhân sự</w:t>
+      </w:r>
       <w:r>
         <w:br/>
         <w:t>5. Change:</w:t>
       </w:r>
       <w:r>
-        <w:t xml:space="preserve"> </w:t>
-      </w:r>
-      <w:proofErr w:type="spellStart"/>
-      <w:r>
-        <w:t>cách</w:t>
-      </w:r>
-      <w:proofErr w:type="spellEnd"/>
-      <w:r>
-        <w:t xml:space="preserve"> </w:t>
-      </w:r>
-      <w:proofErr w:type="spellStart"/>
-      <w:r>
-        <w:t>quản</w:t>
-      </w:r>
-      <w:proofErr w:type="spellEnd"/>
-      <w:r>
-        <w:t xml:space="preserve"> </w:t>
-      </w:r>
-      <w:proofErr w:type="spellStart"/>
-      <w:r>
-        <w:t>lý</w:t>
-      </w:r>
-      <w:proofErr w:type="spellEnd"/>
-      <w:r>
-        <w:t xml:space="preserve"> </w:t>
-      </w:r>
-      <w:proofErr w:type="spellStart"/>
-      <w:r>
-        <w:t>nhân</w:t>
-      </w:r>
-      <w:proofErr w:type="spellEnd"/>
-      <w:r>
-        <w:t xml:space="preserve"> </w:t>
-      </w:r>
-      <w:proofErr w:type="spellStart"/>
-      <w:r>
-        <w:t>sự</w:t>
-      </w:r>
-      <w:proofErr w:type="spellEnd"/>
+        <w:t xml:space="preserve"> cách quản lý nhân sự</w:t>
+      </w:r>
       <w:r>
         <w:br/>
         <w:t>6. Value:</w:t>
       </w:r>
       <w:r>
-        <w:t xml:space="preserve"> </w:t>
-      </w:r>
-      <w:proofErr w:type="spellStart"/>
-      <w:r>
-        <w:t>quản</w:t>
-      </w:r>
-      <w:proofErr w:type="spellEnd"/>
-      <w:r>
-        <w:t xml:space="preserve"> </w:t>
-      </w:r>
-      <w:proofErr w:type="spellStart"/>
-      <w:r>
-        <w:t>lý</w:t>
-      </w:r>
-      <w:proofErr w:type="spellEnd"/>
-      <w:r>
-        <w:t xml:space="preserve"> </w:t>
-      </w:r>
-      <w:proofErr w:type="spellStart"/>
-      <w:r>
-        <w:t>hiệu</w:t>
-      </w:r>
-      <w:proofErr w:type="spellEnd"/>
-      <w:r>
-        <w:t xml:space="preserve"> </w:t>
-      </w:r>
-      <w:proofErr w:type="spellStart"/>
-      <w:r>
-        <w:t>quả</w:t>
-      </w:r>
-      <w:proofErr w:type="spellEnd"/>
-      <w:r>
-        <w:t xml:space="preserve"> </w:t>
-      </w:r>
-      <w:proofErr w:type="spellStart"/>
-      <w:r>
-        <w:t>hơn</w:t>
-      </w:r>
-      <w:proofErr w:type="spellEnd"/>
-      <w:r>
-        <w:t xml:space="preserve">, </w:t>
-      </w:r>
-      <w:proofErr w:type="spellStart"/>
-      <w:r>
-        <w:t>nâng</w:t>
-      </w:r>
-      <w:proofErr w:type="spellEnd"/>
-      <w:r>
-        <w:t xml:space="preserve"> </w:t>
-      </w:r>
-      <w:proofErr w:type="spellStart"/>
-      <w:r>
-        <w:t>cao</w:t>
-      </w:r>
-      <w:proofErr w:type="spellEnd"/>
-      <w:r>
-        <w:t xml:space="preserve"> </w:t>
-      </w:r>
-      <w:proofErr w:type="spellStart"/>
-      <w:r>
-        <w:t>chất</w:t>
-      </w:r>
-      <w:proofErr w:type="spellEnd"/>
-      <w:r>
-        <w:t xml:space="preserve"> </w:t>
-      </w:r>
-      <w:proofErr w:type="spellStart"/>
-      <w:r>
-        <w:t>lượng</w:t>
-      </w:r>
-      <w:proofErr w:type="spellEnd"/>
-      <w:r>
-        <w:t xml:space="preserve"> </w:t>
-      </w:r>
-      <w:proofErr w:type="spellStart"/>
-      <w:r>
-        <w:t>nhân</w:t>
-      </w:r>
-      <w:proofErr w:type="spellEnd"/>
-      <w:r>
-        <w:t xml:space="preserve"> </w:t>
-      </w:r>
-      <w:proofErr w:type="spellStart"/>
-      <w:r>
-        <w:t>sự</w:t>
-      </w:r>
-      <w:proofErr w:type="spellEnd"/>
+        <w:t xml:space="preserve"> quản lý hiệu quả hơn, nâng cao chất lượng nhân sự</w:t>
+      </w:r>
     </w:p>
     <w:p/>
     <w:p/>
@@ -1017,412 +314,122 @@
           <w:bCs/>
         </w:rPr>
         <w:lastRenderedPageBreak/>
-        <w:t xml:space="preserve">B1. List </w:t>
-      </w:r>
-      <w:proofErr w:type="spellStart"/>
-      <w:r>
+        <w:t>B1. List các đầu việc</w:t>
+      </w:r>
+    </w:p>
+    <w:p>
+      <w:pPr>
+        <w:numPr>
+          <w:ilvl w:val="0"/>
+          <w:numId w:val="5"/>
+        </w:numPr>
+      </w:pPr>
+      <w:r>
+        <w:t xml:space="preserve">Xác định nhu cầu tuyển dụng </w:t>
+      </w:r>
+    </w:p>
+    <w:p>
+      <w:pPr>
+        <w:numPr>
+          <w:ilvl w:val="0"/>
+          <w:numId w:val="5"/>
+        </w:numPr>
+      </w:pPr>
+      <w:r>
+        <w:t xml:space="preserve">Đăng bài tuyển dụng </w:t>
+      </w:r>
+    </w:p>
+    <w:p>
+      <w:pPr>
+        <w:numPr>
+          <w:ilvl w:val="0"/>
+          <w:numId w:val="5"/>
+        </w:numPr>
+      </w:pPr>
+      <w:r>
+        <w:t xml:space="preserve">Nhận &amp; lọc CV </w:t>
+      </w:r>
+    </w:p>
+    <w:p>
+      <w:pPr>
+        <w:numPr>
+          <w:ilvl w:val="0"/>
+          <w:numId w:val="5"/>
+        </w:numPr>
+      </w:pPr>
+      <w:r>
+        <w:t xml:space="preserve">Sắp xếp lịch phỏng vấn </w:t>
+      </w:r>
+    </w:p>
+    <w:p>
+      <w:pPr>
+        <w:numPr>
+          <w:ilvl w:val="0"/>
+          <w:numId w:val="5"/>
+        </w:numPr>
+      </w:pPr>
+      <w:r>
+        <w:t xml:space="preserve">Phỏng vấn ứng viên </w:t>
+      </w:r>
+    </w:p>
+    <w:p>
+      <w:pPr>
+        <w:numPr>
+          <w:ilvl w:val="0"/>
+          <w:numId w:val="5"/>
+        </w:numPr>
+      </w:pPr>
+      <w:r>
+        <w:t xml:space="preserve">Đánh giá ứng viên </w:t>
+      </w:r>
+    </w:p>
+    <w:p>
+      <w:pPr>
+        <w:numPr>
+          <w:ilvl w:val="0"/>
+          <w:numId w:val="5"/>
+        </w:numPr>
+      </w:pPr>
+      <w:r>
+        <w:t xml:space="preserve">Quyết định tuyển </w:t>
+      </w:r>
+    </w:p>
+    <w:p>
+      <w:pPr>
+        <w:numPr>
+          <w:ilvl w:val="0"/>
+          <w:numId w:val="5"/>
+        </w:numPr>
+      </w:pPr>
+      <w:r>
+        <w:t xml:space="preserve">Gửi offer </w:t>
+      </w:r>
+    </w:p>
+    <w:p>
+      <w:pPr>
+        <w:numPr>
+          <w:ilvl w:val="0"/>
+          <w:numId w:val="5"/>
+        </w:numPr>
+      </w:pPr>
+      <w:r>
+        <w:t xml:space="preserve">Onboarding </w:t>
+      </w:r>
+    </w:p>
+    <w:p>
+      <w:pPr>
         <w:rPr>
           <w:b/>
           <w:bCs/>
         </w:rPr>
-        <w:t>các</w:t>
-      </w:r>
-      <w:proofErr w:type="spellEnd"/>
+      </w:pPr>
       <w:r>
         <w:rPr>
           <w:b/>
           <w:bCs/>
         </w:rPr>
-        <w:t xml:space="preserve"> </w:t>
-      </w:r>
-      <w:proofErr w:type="spellStart"/>
-      <w:r>
-        <w:rPr>
-          <w:b/>
-          <w:bCs/>
-        </w:rPr>
-        <w:t>đầu</w:t>
-      </w:r>
-      <w:proofErr w:type="spellEnd"/>
-      <w:r>
-        <w:rPr>
-          <w:b/>
-          <w:bCs/>
-        </w:rPr>
-        <w:t xml:space="preserve"> </w:t>
-      </w:r>
-      <w:proofErr w:type="spellStart"/>
-      <w:r>
-        <w:rPr>
-          <w:b/>
-          <w:bCs/>
-        </w:rPr>
-        <w:t>việc</w:t>
-      </w:r>
-      <w:proofErr w:type="spellEnd"/>
-    </w:p>
-    <w:p>
-      <w:pPr>
-        <w:numPr>
-          <w:ilvl w:val="0"/>
-          <w:numId w:val="5"/>
-        </w:numPr>
-      </w:pPr>
-      <w:proofErr w:type="spellStart"/>
-      <w:r>
-        <w:t>Xác</w:t>
-      </w:r>
-      <w:proofErr w:type="spellEnd"/>
-      <w:r>
-        <w:t xml:space="preserve"> </w:t>
-      </w:r>
-      <w:proofErr w:type="spellStart"/>
-      <w:r>
-        <w:t>định</w:t>
-      </w:r>
-      <w:proofErr w:type="spellEnd"/>
-      <w:r>
-        <w:t xml:space="preserve"> </w:t>
-      </w:r>
-      <w:proofErr w:type="spellStart"/>
-      <w:r>
-        <w:t>nhu</w:t>
-      </w:r>
-      <w:proofErr w:type="spellEnd"/>
-      <w:r>
-        <w:t xml:space="preserve"> </w:t>
-      </w:r>
-      <w:proofErr w:type="spellStart"/>
-      <w:r>
-        <w:t>cầu</w:t>
-      </w:r>
-      <w:proofErr w:type="spellEnd"/>
-      <w:r>
-        <w:t xml:space="preserve"> </w:t>
-      </w:r>
-      <w:proofErr w:type="spellStart"/>
-      <w:r>
-        <w:t>tuyển</w:t>
-      </w:r>
-      <w:proofErr w:type="spellEnd"/>
-      <w:r>
-        <w:t xml:space="preserve"> </w:t>
-      </w:r>
-      <w:proofErr w:type="spellStart"/>
-      <w:r>
-        <w:t>dụng</w:t>
-      </w:r>
-      <w:proofErr w:type="spellEnd"/>
-      <w:r>
-        <w:t xml:space="preserve"> </w:t>
-      </w:r>
-    </w:p>
-    <w:p>
-      <w:pPr>
-        <w:numPr>
-          <w:ilvl w:val="0"/>
-          <w:numId w:val="5"/>
-        </w:numPr>
-      </w:pPr>
-      <w:proofErr w:type="spellStart"/>
-      <w:r>
-        <w:t>Đăng</w:t>
-      </w:r>
-      <w:proofErr w:type="spellEnd"/>
-      <w:r>
-        <w:t xml:space="preserve"> </w:t>
-      </w:r>
-      <w:proofErr w:type="spellStart"/>
-      <w:r>
-        <w:t>bài</w:t>
-      </w:r>
-      <w:proofErr w:type="spellEnd"/>
-      <w:r>
-        <w:t xml:space="preserve"> </w:t>
-      </w:r>
-      <w:proofErr w:type="spellStart"/>
-      <w:r>
-        <w:t>tuyển</w:t>
-      </w:r>
-      <w:proofErr w:type="spellEnd"/>
-      <w:r>
-        <w:t xml:space="preserve"> </w:t>
-      </w:r>
-      <w:proofErr w:type="spellStart"/>
-      <w:r>
-        <w:t>dụng</w:t>
-      </w:r>
-      <w:proofErr w:type="spellEnd"/>
-      <w:r>
-        <w:t xml:space="preserve"> </w:t>
-      </w:r>
-    </w:p>
-    <w:p>
-      <w:pPr>
-        <w:numPr>
-          <w:ilvl w:val="0"/>
-          <w:numId w:val="5"/>
-        </w:numPr>
-      </w:pPr>
-      <w:proofErr w:type="spellStart"/>
-      <w:r>
-        <w:t>Nhận</w:t>
-      </w:r>
-      <w:proofErr w:type="spellEnd"/>
-      <w:r>
-        <w:t xml:space="preserve"> &amp; </w:t>
-      </w:r>
-      <w:proofErr w:type="spellStart"/>
-      <w:r>
-        <w:t>lọc</w:t>
-      </w:r>
-      <w:proofErr w:type="spellEnd"/>
-      <w:r>
-        <w:t xml:space="preserve"> CV </w:t>
-      </w:r>
-    </w:p>
-    <w:p>
-      <w:pPr>
-        <w:numPr>
-          <w:ilvl w:val="0"/>
-          <w:numId w:val="5"/>
-        </w:numPr>
-      </w:pPr>
-      <w:proofErr w:type="spellStart"/>
-      <w:r>
-        <w:t>Sắp</w:t>
-      </w:r>
-      <w:proofErr w:type="spellEnd"/>
-      <w:r>
-        <w:t xml:space="preserve"> </w:t>
-      </w:r>
-      <w:proofErr w:type="spellStart"/>
-      <w:r>
-        <w:t>xếp</w:t>
-      </w:r>
-      <w:proofErr w:type="spellEnd"/>
-      <w:r>
-        <w:t xml:space="preserve"> </w:t>
-      </w:r>
-      <w:proofErr w:type="spellStart"/>
-      <w:r>
-        <w:t>lịch</w:t>
-      </w:r>
-      <w:proofErr w:type="spellEnd"/>
-      <w:r>
-        <w:t xml:space="preserve"> </w:t>
-      </w:r>
-      <w:proofErr w:type="spellStart"/>
-      <w:r>
-        <w:t>phỏng</w:t>
-      </w:r>
-      <w:proofErr w:type="spellEnd"/>
-      <w:r>
-        <w:t xml:space="preserve"> </w:t>
-      </w:r>
-      <w:proofErr w:type="spellStart"/>
-      <w:r>
-        <w:t>vấn</w:t>
-      </w:r>
-      <w:proofErr w:type="spellEnd"/>
-      <w:r>
-        <w:t xml:space="preserve"> </w:t>
-      </w:r>
-    </w:p>
-    <w:p>
-      <w:pPr>
-        <w:numPr>
-          <w:ilvl w:val="0"/>
-          <w:numId w:val="5"/>
-        </w:numPr>
-      </w:pPr>
-      <w:proofErr w:type="spellStart"/>
-      <w:r>
-        <w:t>Phỏng</w:t>
-      </w:r>
-      <w:proofErr w:type="spellEnd"/>
-      <w:r>
-        <w:t xml:space="preserve"> </w:t>
-      </w:r>
-      <w:proofErr w:type="spellStart"/>
-      <w:r>
-        <w:t>vấn</w:t>
-      </w:r>
-      <w:proofErr w:type="spellEnd"/>
-      <w:r>
-        <w:t xml:space="preserve"> </w:t>
-      </w:r>
-      <w:proofErr w:type="spellStart"/>
-      <w:r>
-        <w:t>ứng</w:t>
-      </w:r>
-      <w:proofErr w:type="spellEnd"/>
-      <w:r>
-        <w:t xml:space="preserve"> </w:t>
-      </w:r>
-      <w:proofErr w:type="spellStart"/>
-      <w:r>
-        <w:t>viên</w:t>
-      </w:r>
-      <w:proofErr w:type="spellEnd"/>
-      <w:r>
-        <w:t xml:space="preserve"> </w:t>
-      </w:r>
-    </w:p>
-    <w:p>
-      <w:pPr>
-        <w:numPr>
-          <w:ilvl w:val="0"/>
-          <w:numId w:val="5"/>
-        </w:numPr>
-      </w:pPr>
-      <w:proofErr w:type="spellStart"/>
-      <w:r>
-        <w:t>Đánh</w:t>
-      </w:r>
-      <w:proofErr w:type="spellEnd"/>
-      <w:r>
-        <w:t xml:space="preserve"> </w:t>
-      </w:r>
-      <w:proofErr w:type="spellStart"/>
-      <w:r>
-        <w:t>giá</w:t>
-      </w:r>
-      <w:proofErr w:type="spellEnd"/>
-      <w:r>
-        <w:t xml:space="preserve"> </w:t>
-      </w:r>
-      <w:proofErr w:type="spellStart"/>
-      <w:r>
-        <w:t>ứng</w:t>
-      </w:r>
-      <w:proofErr w:type="spellEnd"/>
-      <w:r>
-        <w:t xml:space="preserve"> </w:t>
-      </w:r>
-      <w:proofErr w:type="spellStart"/>
-      <w:r>
-        <w:t>viên</w:t>
-      </w:r>
-      <w:proofErr w:type="spellEnd"/>
-      <w:r>
-        <w:t xml:space="preserve"> </w:t>
-      </w:r>
-    </w:p>
-    <w:p>
-      <w:pPr>
-        <w:numPr>
-          <w:ilvl w:val="0"/>
-          <w:numId w:val="5"/>
-        </w:numPr>
-      </w:pPr>
-      <w:proofErr w:type="spellStart"/>
-      <w:r>
-        <w:t>Quyết</w:t>
-      </w:r>
-      <w:proofErr w:type="spellEnd"/>
-      <w:r>
-        <w:t xml:space="preserve"> </w:t>
-      </w:r>
-      <w:proofErr w:type="spellStart"/>
-      <w:r>
-        <w:t>định</w:t>
-      </w:r>
-      <w:proofErr w:type="spellEnd"/>
-      <w:r>
-        <w:t xml:space="preserve"> </w:t>
-      </w:r>
-      <w:proofErr w:type="spellStart"/>
-      <w:r>
-        <w:t>tuyển</w:t>
-      </w:r>
-      <w:proofErr w:type="spellEnd"/>
-      <w:r>
-        <w:t xml:space="preserve"> </w:t>
-      </w:r>
-    </w:p>
-    <w:p>
-      <w:pPr>
-        <w:numPr>
-          <w:ilvl w:val="0"/>
-          <w:numId w:val="5"/>
-        </w:numPr>
-      </w:pPr>
-      <w:proofErr w:type="spellStart"/>
-      <w:r>
-        <w:t>Gửi</w:t>
-      </w:r>
-      <w:proofErr w:type="spellEnd"/>
-      <w:r>
-        <w:t xml:space="preserve"> offer </w:t>
-      </w:r>
-    </w:p>
-    <w:p>
-      <w:pPr>
-        <w:numPr>
-          <w:ilvl w:val="0"/>
-          <w:numId w:val="5"/>
-        </w:numPr>
-      </w:pPr>
-      <w:r>
-        <w:t xml:space="preserve">Onboarding </w:t>
-      </w:r>
-    </w:p>
-    <w:p>
-      <w:pPr>
-        <w:rPr>
-          <w:b/>
-          <w:bCs/>
-        </w:rPr>
-      </w:pPr>
-      <w:r>
-        <w:rPr>
-          <w:b/>
-          <w:bCs/>
-        </w:rPr>
-        <w:t xml:space="preserve"> B2. Các </w:t>
-      </w:r>
-      <w:proofErr w:type="spellStart"/>
-      <w:r>
-        <w:rPr>
-          <w:b/>
-          <w:bCs/>
-        </w:rPr>
-        <w:t>bên</w:t>
-      </w:r>
-      <w:proofErr w:type="spellEnd"/>
-      <w:r>
-        <w:rPr>
-          <w:b/>
-          <w:bCs/>
-        </w:rPr>
-        <w:t xml:space="preserve"> </w:t>
-      </w:r>
-      <w:proofErr w:type="spellStart"/>
-      <w:r>
-        <w:rPr>
-          <w:b/>
-          <w:bCs/>
-        </w:rPr>
-        <w:t>liên</w:t>
-      </w:r>
-      <w:proofErr w:type="spellEnd"/>
-      <w:r>
-        <w:rPr>
-          <w:b/>
-          <w:bCs/>
-        </w:rPr>
-        <w:t xml:space="preserve"> </w:t>
-      </w:r>
-      <w:proofErr w:type="spellStart"/>
-      <w:r>
-        <w:rPr>
-          <w:b/>
-          <w:bCs/>
-        </w:rPr>
-        <w:t>quan</w:t>
-      </w:r>
-      <w:proofErr w:type="spellEnd"/>
+        <w:t xml:space="preserve"> B2. Các bên liên quan</w:t>
+      </w:r>
     </w:p>
     <w:p>
       <w:pPr>
@@ -1439,23 +446,7 @@
         <w:t>HR</w:t>
       </w:r>
       <w:r>
-        <w:t xml:space="preserve"> (</w:t>
-      </w:r>
-      <w:proofErr w:type="spellStart"/>
-      <w:r>
-        <w:t>Nhân</w:t>
-      </w:r>
-      <w:proofErr w:type="spellEnd"/>
-      <w:r>
-        <w:t xml:space="preserve"> </w:t>
-      </w:r>
-      <w:proofErr w:type="spellStart"/>
-      <w:r>
-        <w:t>sự</w:t>
-      </w:r>
-      <w:proofErr w:type="spellEnd"/>
-      <w:r>
-        <w:t xml:space="preserve">) </w:t>
+        <w:t xml:space="preserve"> (Nhân sự) </w:t>
       </w:r>
     </w:p>
     <w:p>
@@ -1491,47 +482,7 @@
         <w:t>Interviewer</w:t>
       </w:r>
       <w:r>
-        <w:t xml:space="preserve"> (</w:t>
-      </w:r>
-      <w:proofErr w:type="spellStart"/>
-      <w:r>
-        <w:t>Người</w:t>
-      </w:r>
-      <w:proofErr w:type="spellEnd"/>
-      <w:r>
-        <w:t xml:space="preserve"> </w:t>
-      </w:r>
-      <w:proofErr w:type="spellStart"/>
-      <w:r>
-        <w:t>phỏng</w:t>
-      </w:r>
-      <w:proofErr w:type="spellEnd"/>
-      <w:r>
-        <w:t xml:space="preserve"> </w:t>
-      </w:r>
-      <w:proofErr w:type="spellStart"/>
-      <w:r>
-        <w:t>vấn</w:t>
-      </w:r>
-      <w:proofErr w:type="spellEnd"/>
-      <w:r>
-        <w:t xml:space="preserve"> / </w:t>
-      </w:r>
-      <w:proofErr w:type="spellStart"/>
-      <w:r>
-        <w:t>chuyên</w:t>
-      </w:r>
-      <w:proofErr w:type="spellEnd"/>
-      <w:r>
-        <w:t xml:space="preserve"> </w:t>
-      </w:r>
-      <w:proofErr w:type="spellStart"/>
-      <w:r>
-        <w:t>môn</w:t>
-      </w:r>
-      <w:proofErr w:type="spellEnd"/>
-      <w:r>
-        <w:t xml:space="preserve">) </w:t>
+        <w:t xml:space="preserve"> (Người phỏng vấn / chuyên môn) </w:t>
       </w:r>
     </w:p>
     <w:p>
@@ -1541,123 +492,48 @@
           <w:numId w:val="6"/>
         </w:numPr>
       </w:pPr>
-      <w:proofErr w:type="spellStart"/>
       <w:r>
         <w:rPr>
           <w:b/>
           <w:bCs/>
         </w:rPr>
-        <w:t>Ứng</w:t>
-      </w:r>
-      <w:proofErr w:type="spellEnd"/>
+        <w:t>Ứng viên</w:t>
+      </w:r>
+      <w:r>
+        <w:t xml:space="preserve"> </w:t>
+      </w:r>
+    </w:p>
+    <w:p>
+      <w:pPr>
+        <w:numPr>
+          <w:ilvl w:val="0"/>
+          <w:numId w:val="6"/>
+        </w:numPr>
+      </w:pPr>
       <w:r>
         <w:rPr>
           <w:b/>
           <w:bCs/>
         </w:rPr>
-        <w:t xml:space="preserve"> </w:t>
-      </w:r>
-      <w:proofErr w:type="spellStart"/>
-      <w:r>
+        <w:t>Người request</w:t>
+      </w:r>
+      <w:r>
+        <w:t xml:space="preserve"> (người yêu cầu tuyển) </w:t>
+      </w:r>
+    </w:p>
+    <w:p>
+      <w:pPr>
         <w:rPr>
           <w:b/>
           <w:bCs/>
         </w:rPr>
-        <w:t>viên</w:t>
-      </w:r>
-      <w:proofErr w:type="spellEnd"/>
-      <w:r>
-        <w:t xml:space="preserve"> </w:t>
-      </w:r>
-    </w:p>
-    <w:p>
-      <w:pPr>
-        <w:numPr>
-          <w:ilvl w:val="0"/>
-          <w:numId w:val="6"/>
-        </w:numPr>
-      </w:pPr>
-      <w:proofErr w:type="spellStart"/>
+      </w:pPr>
       <w:r>
         <w:rPr>
           <w:b/>
           <w:bCs/>
         </w:rPr>
-        <w:t>Người</w:t>
-      </w:r>
-      <w:proofErr w:type="spellEnd"/>
-      <w:r>
-        <w:rPr>
-          <w:b/>
-          <w:bCs/>
-        </w:rPr>
-        <w:t xml:space="preserve"> request</w:t>
-      </w:r>
-      <w:r>
-        <w:t xml:space="preserve"> (</w:t>
-      </w:r>
-      <w:proofErr w:type="spellStart"/>
-      <w:r>
-        <w:t>người</w:t>
-      </w:r>
-      <w:proofErr w:type="spellEnd"/>
-      <w:r>
-        <w:t xml:space="preserve"> </w:t>
-      </w:r>
-      <w:proofErr w:type="spellStart"/>
-      <w:r>
-        <w:t>yêu</w:t>
-      </w:r>
-      <w:proofErr w:type="spellEnd"/>
-      <w:r>
-        <w:t xml:space="preserve"> </w:t>
-      </w:r>
-      <w:proofErr w:type="spellStart"/>
-      <w:r>
-        <w:t>cầu</w:t>
-      </w:r>
-      <w:proofErr w:type="spellEnd"/>
-      <w:r>
-        <w:t xml:space="preserve"> </w:t>
-      </w:r>
-      <w:proofErr w:type="spellStart"/>
-      <w:r>
-        <w:t>tuyển</w:t>
-      </w:r>
-      <w:proofErr w:type="spellEnd"/>
-      <w:r>
-        <w:t xml:space="preserve">) </w:t>
-      </w:r>
-    </w:p>
-    <w:p>
-      <w:pPr>
-        <w:rPr>
-          <w:b/>
-          <w:bCs/>
-        </w:rPr>
-      </w:pPr>
-      <w:r>
-        <w:rPr>
-          <w:b/>
-          <w:bCs/>
-        </w:rPr>
-        <w:t xml:space="preserve">B3. Ma </w:t>
-      </w:r>
-      <w:proofErr w:type="spellStart"/>
-      <w:r>
-        <w:rPr>
-          <w:b/>
-          <w:bCs/>
-        </w:rPr>
-        <w:t>trận</w:t>
-      </w:r>
-      <w:proofErr w:type="spellEnd"/>
-      <w:r>
-        <w:rPr>
-          <w:b/>
-          <w:bCs/>
-        </w:rPr>
-        <w:t xml:space="preserve"> RACI</w:t>
+        <w:t>B3. Ma trận RACI</w:t>
       </w:r>
     </w:p>
     <w:tbl>
@@ -1693,17 +569,8 @@
                 <w:b/>
                 <w:bCs/>
               </w:rPr>
-              <w:t xml:space="preserve">Công </w:t>
-            </w:r>
-            <w:proofErr w:type="spellStart"/>
-            <w:r>
-              <w:rPr>
-                <w:b/>
-                <w:bCs/>
-              </w:rPr>
-              <w:t>việc</w:t>
-            </w:r>
-            <w:proofErr w:type="spellEnd"/>
+              <w:t>Công việc</w:t>
+            </w:r>
           </w:p>
         </w:tc>
         <w:tc>
@@ -1785,61 +652,34 @@
                 <w:bCs/>
               </w:rPr>
             </w:pPr>
-            <w:proofErr w:type="spellStart"/>
             <w:r>
               <w:rPr>
                 <w:b/>
                 <w:bCs/>
               </w:rPr>
-              <w:t>Ứng</w:t>
-            </w:r>
-            <w:proofErr w:type="spellEnd"/>
-            <w:r>
+              <w:t>Ứng viên</w:t>
+            </w:r>
+          </w:p>
+        </w:tc>
+        <w:tc>
+          <w:tcPr>
+            <w:tcW w:w="0" w:type="auto"/>
+            <w:hideMark/>
+          </w:tcPr>
+          <w:p>
+            <w:pPr>
+              <w:spacing w:after="160" w:line="259" w:lineRule="auto"/>
               <w:rPr>
                 <w:b/>
                 <w:bCs/>
               </w:rPr>
-              <w:t xml:space="preserve"> </w:t>
-            </w:r>
-            <w:proofErr w:type="spellStart"/>
+            </w:pPr>
             <w:r>
               <w:rPr>
                 <w:b/>
                 <w:bCs/>
               </w:rPr>
-              <w:t>viên</w:t>
-            </w:r>
-            <w:proofErr w:type="spellEnd"/>
-          </w:p>
-        </w:tc>
-        <w:tc>
-          <w:tcPr>
-            <w:tcW w:w="0" w:type="auto"/>
-            <w:hideMark/>
-          </w:tcPr>
-          <w:p>
-            <w:pPr>
-              <w:spacing w:after="160" w:line="259" w:lineRule="auto"/>
-              <w:rPr>
-                <w:b/>
-                <w:bCs/>
-              </w:rPr>
-            </w:pPr>
-            <w:proofErr w:type="spellStart"/>
-            <w:r>
-              <w:rPr>
-                <w:b/>
-                <w:bCs/>
-              </w:rPr>
-              <w:t>Người</w:t>
-            </w:r>
-            <w:proofErr w:type="spellEnd"/>
-            <w:r>
-              <w:rPr>
-                <w:b/>
-                <w:bCs/>
-              </w:rPr>
-              <w:t xml:space="preserve"> request</w:t>
+              <w:t>Người request</w:t>
             </w:r>
           </w:p>
         </w:tc>
@@ -1854,43 +694,9 @@
             <w:pPr>
               <w:spacing w:after="160" w:line="259" w:lineRule="auto"/>
             </w:pPr>
-            <w:proofErr w:type="spellStart"/>
-            <w:r>
-              <w:t>Xác</w:t>
-            </w:r>
-            <w:proofErr w:type="spellEnd"/>
-            <w:r>
-              <w:t xml:space="preserve"> </w:t>
-            </w:r>
-            <w:proofErr w:type="spellStart"/>
-            <w:r>
-              <w:t>định</w:t>
-            </w:r>
-            <w:proofErr w:type="spellEnd"/>
-            <w:r>
-              <w:t xml:space="preserve"> </w:t>
-            </w:r>
-            <w:proofErr w:type="spellStart"/>
-            <w:r>
-              <w:t>nhu</w:t>
-            </w:r>
-            <w:proofErr w:type="spellEnd"/>
-            <w:r>
-              <w:t xml:space="preserve"> </w:t>
-            </w:r>
-            <w:proofErr w:type="spellStart"/>
-            <w:r>
-              <w:t>cầu</w:t>
-            </w:r>
-            <w:proofErr w:type="spellEnd"/>
-            <w:r>
-              <w:t xml:space="preserve"> </w:t>
-            </w:r>
-            <w:proofErr w:type="spellStart"/>
-            <w:r>
-              <w:t>tuyển</w:t>
-            </w:r>
-            <w:proofErr w:type="spellEnd"/>
+            <w:r>
+              <w:t>Xác định nhu cầu tuyển</w:t>
+            </w:r>
           </w:p>
         </w:tc>
         <w:tc>
@@ -1974,35 +780,9 @@
             <w:pPr>
               <w:spacing w:after="160" w:line="259" w:lineRule="auto"/>
             </w:pPr>
-            <w:proofErr w:type="spellStart"/>
-            <w:r>
-              <w:t>Đăng</w:t>
-            </w:r>
-            <w:proofErr w:type="spellEnd"/>
-            <w:r>
-              <w:t xml:space="preserve"> </w:t>
-            </w:r>
-            <w:proofErr w:type="spellStart"/>
-            <w:r>
-              <w:t>bài</w:t>
-            </w:r>
-            <w:proofErr w:type="spellEnd"/>
-            <w:r>
-              <w:t xml:space="preserve"> </w:t>
-            </w:r>
-            <w:proofErr w:type="spellStart"/>
-            <w:r>
-              <w:t>tuyển</w:t>
-            </w:r>
-            <w:proofErr w:type="spellEnd"/>
-            <w:r>
-              <w:t xml:space="preserve"> </w:t>
-            </w:r>
-            <w:proofErr w:type="spellStart"/>
-            <w:r>
-              <w:t>dụng</w:t>
-            </w:r>
-            <w:proofErr w:type="spellEnd"/>
+            <w:r>
+              <w:t>Đăng bài tuyển dụng</w:t>
+            </w:r>
           </w:p>
         </w:tc>
         <w:tc>
@@ -2086,21 +866,8 @@
             <w:pPr>
               <w:spacing w:after="160" w:line="259" w:lineRule="auto"/>
             </w:pPr>
-            <w:proofErr w:type="spellStart"/>
-            <w:r>
-              <w:t>Nhận</w:t>
-            </w:r>
-            <w:proofErr w:type="spellEnd"/>
-            <w:r>
-              <w:t xml:space="preserve"> &amp; </w:t>
-            </w:r>
-            <w:proofErr w:type="spellStart"/>
-            <w:r>
-              <w:t>lọc</w:t>
-            </w:r>
-            <w:proofErr w:type="spellEnd"/>
-            <w:r>
-              <w:t xml:space="preserve"> CV</w:t>
+            <w:r>
+              <w:t>Nhận &amp; lọc CV</w:t>
             </w:r>
           </w:p>
         </w:tc>
@@ -2185,29 +952,8 @@
             <w:pPr>
               <w:spacing w:after="160" w:line="259" w:lineRule="auto"/>
             </w:pPr>
-            <w:proofErr w:type="spellStart"/>
-            <w:r>
-              <w:t>Sắp</w:t>
-            </w:r>
-            <w:proofErr w:type="spellEnd"/>
-            <w:r>
-              <w:t xml:space="preserve"> </w:t>
-            </w:r>
-            <w:proofErr w:type="spellStart"/>
-            <w:r>
-              <w:t>xếp</w:t>
-            </w:r>
-            <w:proofErr w:type="spellEnd"/>
-            <w:r>
-              <w:t xml:space="preserve"> </w:t>
-            </w:r>
-            <w:proofErr w:type="spellStart"/>
-            <w:r>
-              <w:t>lịch</w:t>
-            </w:r>
-            <w:proofErr w:type="spellEnd"/>
-            <w:r>
-              <w:t xml:space="preserve"> PV</w:t>
+            <w:r>
+              <w:t>Sắp xếp lịch PV</w:t>
             </w:r>
           </w:p>
         </w:tc>
@@ -2292,35 +1038,9 @@
             <w:pPr>
               <w:spacing w:after="160" w:line="259" w:lineRule="auto"/>
             </w:pPr>
-            <w:proofErr w:type="spellStart"/>
-            <w:r>
-              <w:t>Phỏng</w:t>
-            </w:r>
-            <w:proofErr w:type="spellEnd"/>
-            <w:r>
-              <w:t xml:space="preserve"> </w:t>
-            </w:r>
-            <w:proofErr w:type="spellStart"/>
-            <w:r>
-              <w:t>vấn</w:t>
-            </w:r>
-            <w:proofErr w:type="spellEnd"/>
-            <w:r>
-              <w:t xml:space="preserve"> </w:t>
-            </w:r>
-            <w:proofErr w:type="spellStart"/>
-            <w:r>
-              <w:t>ứng</w:t>
-            </w:r>
-            <w:proofErr w:type="spellEnd"/>
-            <w:r>
-              <w:t xml:space="preserve"> </w:t>
-            </w:r>
-            <w:proofErr w:type="spellStart"/>
-            <w:r>
-              <w:t>viên</w:t>
-            </w:r>
-            <w:proofErr w:type="spellEnd"/>
+            <w:r>
+              <w:t>Phỏng vấn ứng viên</w:t>
+            </w:r>
           </w:p>
         </w:tc>
         <w:tc>
@@ -2404,35 +1124,9 @@
             <w:pPr>
               <w:spacing w:after="160" w:line="259" w:lineRule="auto"/>
             </w:pPr>
-            <w:proofErr w:type="spellStart"/>
-            <w:r>
-              <w:t>Đánh</w:t>
-            </w:r>
-            <w:proofErr w:type="spellEnd"/>
-            <w:r>
-              <w:t xml:space="preserve"> </w:t>
-            </w:r>
-            <w:proofErr w:type="spellStart"/>
-            <w:r>
-              <w:t>giá</w:t>
-            </w:r>
-            <w:proofErr w:type="spellEnd"/>
-            <w:r>
-              <w:t xml:space="preserve"> </w:t>
-            </w:r>
-            <w:proofErr w:type="spellStart"/>
-            <w:r>
-              <w:t>ứng</w:t>
-            </w:r>
-            <w:proofErr w:type="spellEnd"/>
-            <w:r>
-              <w:t xml:space="preserve"> </w:t>
-            </w:r>
-            <w:proofErr w:type="spellStart"/>
-            <w:r>
-              <w:t>viên</w:t>
-            </w:r>
-            <w:proofErr w:type="spellEnd"/>
+            <w:r>
+              <w:t>Đánh giá ứng viên</w:t>
+            </w:r>
           </w:p>
         </w:tc>
         <w:tc>
@@ -2516,27 +1210,9 @@
             <w:pPr>
               <w:spacing w:after="160" w:line="259" w:lineRule="auto"/>
             </w:pPr>
-            <w:proofErr w:type="spellStart"/>
-            <w:r>
-              <w:t>Quyết</w:t>
-            </w:r>
-            <w:proofErr w:type="spellEnd"/>
-            <w:r>
-              <w:t xml:space="preserve"> </w:t>
-            </w:r>
-            <w:proofErr w:type="spellStart"/>
-            <w:r>
-              <w:t>định</w:t>
-            </w:r>
-            <w:proofErr w:type="spellEnd"/>
-            <w:r>
-              <w:t xml:space="preserve"> </w:t>
-            </w:r>
-            <w:proofErr w:type="spellStart"/>
-            <w:r>
-              <w:t>tuyển</w:t>
-            </w:r>
-            <w:proofErr w:type="spellEnd"/>
+            <w:r>
+              <w:t>Quyết định tuyển</w:t>
+            </w:r>
           </w:p>
         </w:tc>
         <w:tc>
@@ -2620,13 +1296,8 @@
             <w:pPr>
               <w:spacing w:after="160" w:line="259" w:lineRule="auto"/>
             </w:pPr>
-            <w:proofErr w:type="spellStart"/>
-            <w:r>
-              <w:t>Gửi</w:t>
-            </w:r>
-            <w:proofErr w:type="spellEnd"/>
-            <w:r>
-              <w:t xml:space="preserve"> offer</w:t>
+            <w:r>
+              <w:t>Gửi offer</w:t>
             </w:r>
           </w:p>
         </w:tc>
@@ -2793,468 +1464,80 @@
     <w:p/>
     <w:p>
       <w:r>
-        <w:t xml:space="preserve">■ Responsible: </w:t>
-      </w:r>
-      <w:proofErr w:type="spellStart"/>
-      <w:r>
-        <w:t>Người</w:t>
-      </w:r>
-      <w:proofErr w:type="spellEnd"/>
+        <w:t>■ Responsible: Người thực</w:t>
+      </w:r>
       <w:r>
         <w:t xml:space="preserve"> </w:t>
       </w:r>
-      <w:proofErr w:type="spellStart"/>
-      <w:r>
-        <w:t>thực</w:t>
-      </w:r>
-      <w:proofErr w:type="spellEnd"/>
+      <w:r>
+        <w:t>hiện công việc</w:t>
+      </w:r>
+      <w:r>
+        <w:br/>
+        <w:t>■ Accountable: Người quyết</w:t>
+      </w:r>
       <w:r>
         <w:t xml:space="preserve"> </w:t>
       </w:r>
-      <w:proofErr w:type="spellStart"/>
-      <w:r>
-        <w:t>hiện</w:t>
-      </w:r>
-      <w:proofErr w:type="spellEnd"/>
+      <w:r>
+        <w:t>định và có quyền sở hữu</w:t>
+      </w:r>
       <w:r>
         <w:t xml:space="preserve"> </w:t>
       </w:r>
-      <w:proofErr w:type="spellStart"/>
-      <w:r>
-        <w:t>công</w:t>
-      </w:r>
-      <w:proofErr w:type="spellEnd"/>
+      <w:r>
+        <w:t>cu</w:t>
+      </w:r>
+      <w:r>
+        <w:t>ố</w:t>
+      </w:r>
+      <w:r>
+        <w:t>i cùng</w:t>
+      </w:r>
+      <w:r>
+        <w:br/>
+        <w:t>■ Consult: Người được tham</w:t>
+      </w:r>
       <w:r>
         <w:t xml:space="preserve"> </w:t>
       </w:r>
-      <w:proofErr w:type="spellStart"/>
-      <w:r>
-        <w:t>việc</w:t>
-      </w:r>
-      <w:proofErr w:type="spellEnd"/>
+      <w:r>
+        <w:t>khảo ý kiến trước khi đưa ra</w:t>
+      </w:r>
+      <w:r>
+        <w:t xml:space="preserve"> </w:t>
+      </w:r>
+      <w:r>
+        <w:t>quyết định</w:t>
+      </w:r>
       <w:r>
         <w:br/>
-        <w:t xml:space="preserve">■ Accountable: </w:t>
-      </w:r>
-      <w:proofErr w:type="spellStart"/>
-      <w:r>
-        <w:t>Người</w:t>
-      </w:r>
-      <w:proofErr w:type="spellEnd"/>
+        <w:t>■ Informed: Người được</w:t>
+      </w:r>
       <w:r>
         <w:t xml:space="preserve"> </w:t>
       </w:r>
-      <w:proofErr w:type="spellStart"/>
-      <w:r>
-        <w:t>quyết</w:t>
-      </w:r>
-      <w:proofErr w:type="spellEnd"/>
+      <w:r>
+        <w:t>thông báo về quyết định</w:t>
+      </w:r>
+      <w:r>
+        <w:br/>
+        <w:t>■ Support: Người hỗ trợ quá</w:t>
+      </w:r>
       <w:r>
         <w:t xml:space="preserve"> </w:t>
       </w:r>
-      <w:proofErr w:type="spellStart"/>
-      <w:r>
-        <w:t>định</w:t>
-      </w:r>
-      <w:proofErr w:type="spellEnd"/>
-      <w:r>
-        <w:t xml:space="preserve"> </w:t>
-      </w:r>
-      <w:proofErr w:type="spellStart"/>
-      <w:r>
-        <w:t>và</w:t>
-      </w:r>
-      <w:proofErr w:type="spellEnd"/>
-      <w:r>
-        <w:t xml:space="preserve"> </w:t>
-      </w:r>
-      <w:proofErr w:type="spellStart"/>
-      <w:r>
-        <w:t>có</w:t>
-      </w:r>
-      <w:proofErr w:type="spellEnd"/>
-      <w:r>
-        <w:t xml:space="preserve"> </w:t>
-      </w:r>
-      <w:proofErr w:type="spellStart"/>
-      <w:r>
-        <w:t>quyền</w:t>
-      </w:r>
-      <w:proofErr w:type="spellEnd"/>
-      <w:r>
-        <w:t xml:space="preserve"> </w:t>
-      </w:r>
-      <w:proofErr w:type="spellStart"/>
-      <w:r>
-        <w:t>sở</w:t>
-      </w:r>
-      <w:proofErr w:type="spellEnd"/>
-      <w:r>
-        <w:t xml:space="preserve"> </w:t>
-      </w:r>
-      <w:proofErr w:type="spellStart"/>
-      <w:r>
-        <w:t>hữu</w:t>
-      </w:r>
-      <w:proofErr w:type="spellEnd"/>
-      <w:r>
-        <w:t xml:space="preserve"> </w:t>
-      </w:r>
-      <w:proofErr w:type="spellStart"/>
-      <w:r>
-        <w:t>cu</w:t>
-      </w:r>
-      <w:r>
-        <w:t>ố</w:t>
-      </w:r>
-      <w:r>
-        <w:t>i</w:t>
-      </w:r>
-      <w:proofErr w:type="spellEnd"/>
-      <w:r>
-        <w:t xml:space="preserve"> </w:t>
-      </w:r>
-      <w:proofErr w:type="spellStart"/>
-      <w:r>
-        <w:t>cùng</w:t>
-      </w:r>
-      <w:proofErr w:type="spellEnd"/>
-      <w:r>
-        <w:br/>
-        <w:t xml:space="preserve">■ Consult: </w:t>
-      </w:r>
-      <w:proofErr w:type="spellStart"/>
-      <w:r>
-        <w:t>Người</w:t>
-      </w:r>
-      <w:proofErr w:type="spellEnd"/>
-      <w:r>
-        <w:t xml:space="preserve"> </w:t>
-      </w:r>
-      <w:proofErr w:type="spellStart"/>
-      <w:r>
-        <w:t>được</w:t>
-      </w:r>
-      <w:proofErr w:type="spellEnd"/>
-      <w:r>
-        <w:t xml:space="preserve"> </w:t>
-      </w:r>
-      <w:proofErr w:type="spellStart"/>
-      <w:r>
-        <w:t>tham</w:t>
-      </w:r>
-      <w:proofErr w:type="spellEnd"/>
-      <w:r>
-        <w:t xml:space="preserve"> </w:t>
-      </w:r>
-      <w:proofErr w:type="spellStart"/>
-      <w:r>
-        <w:t>khảo</w:t>
-      </w:r>
-      <w:proofErr w:type="spellEnd"/>
-      <w:r>
-        <w:t xml:space="preserve"> ý </w:t>
-      </w:r>
-      <w:proofErr w:type="spellStart"/>
-      <w:r>
-        <w:t>kiến</w:t>
-      </w:r>
-      <w:proofErr w:type="spellEnd"/>
-      <w:r>
-        <w:t xml:space="preserve"> </w:t>
-      </w:r>
-      <w:proofErr w:type="spellStart"/>
-      <w:r>
-        <w:t>trước</w:t>
-      </w:r>
-      <w:proofErr w:type="spellEnd"/>
-      <w:r>
-        <w:t xml:space="preserve"> </w:t>
-      </w:r>
-      <w:proofErr w:type="spellStart"/>
-      <w:r>
-        <w:t>khi</w:t>
-      </w:r>
-      <w:proofErr w:type="spellEnd"/>
-      <w:r>
-        <w:t xml:space="preserve"> </w:t>
-      </w:r>
-      <w:proofErr w:type="spellStart"/>
-      <w:r>
-        <w:t>đưa</w:t>
-      </w:r>
-      <w:proofErr w:type="spellEnd"/>
-      <w:r>
-        <w:t xml:space="preserve"> </w:t>
-      </w:r>
-      <w:proofErr w:type="spellStart"/>
-      <w:r>
-        <w:t>ra</w:t>
-      </w:r>
-      <w:proofErr w:type="spellEnd"/>
-      <w:r>
-        <w:t xml:space="preserve"> </w:t>
-      </w:r>
-      <w:proofErr w:type="spellStart"/>
-      <w:r>
-        <w:t>quyết</w:t>
-      </w:r>
-      <w:proofErr w:type="spellEnd"/>
-      <w:r>
-        <w:t xml:space="preserve"> </w:t>
-      </w:r>
-      <w:proofErr w:type="spellStart"/>
-      <w:r>
-        <w:t>định</w:t>
-      </w:r>
-      <w:proofErr w:type="spellEnd"/>
-      <w:r>
-        <w:br/>
-        <w:t xml:space="preserve">■ Informed: </w:t>
-      </w:r>
-      <w:proofErr w:type="spellStart"/>
-      <w:r>
-        <w:t>Người</w:t>
-      </w:r>
-      <w:proofErr w:type="spellEnd"/>
-      <w:r>
-        <w:t xml:space="preserve"> </w:t>
-      </w:r>
-      <w:proofErr w:type="spellStart"/>
-      <w:r>
-        <w:t>được</w:t>
-      </w:r>
-      <w:proofErr w:type="spellEnd"/>
-      <w:r>
-        <w:t xml:space="preserve"> </w:t>
-      </w:r>
-      <w:proofErr w:type="spellStart"/>
-      <w:r>
-        <w:t>thông</w:t>
-      </w:r>
-      <w:proofErr w:type="spellEnd"/>
-      <w:r>
-        <w:t xml:space="preserve"> </w:t>
-      </w:r>
-      <w:proofErr w:type="spellStart"/>
-      <w:r>
-        <w:t>báo</w:t>
-      </w:r>
-      <w:proofErr w:type="spellEnd"/>
-      <w:r>
-        <w:t xml:space="preserve"> </w:t>
-      </w:r>
-      <w:proofErr w:type="spellStart"/>
-      <w:r>
-        <w:t>về</w:t>
-      </w:r>
-      <w:proofErr w:type="spellEnd"/>
-      <w:r>
-        <w:t xml:space="preserve"> </w:t>
-      </w:r>
-      <w:proofErr w:type="spellStart"/>
-      <w:r>
-        <w:t>quyết</w:t>
-      </w:r>
-      <w:proofErr w:type="spellEnd"/>
-      <w:r>
-        <w:t xml:space="preserve"> </w:t>
-      </w:r>
-      <w:proofErr w:type="spellStart"/>
-      <w:r>
-        <w:t>định</w:t>
-      </w:r>
-      <w:proofErr w:type="spellEnd"/>
-      <w:r>
-        <w:br/>
-        <w:t xml:space="preserve">■ Support: </w:t>
-      </w:r>
-      <w:proofErr w:type="spellStart"/>
-      <w:r>
-        <w:t>Người</w:t>
-      </w:r>
-      <w:proofErr w:type="spellEnd"/>
-      <w:r>
-        <w:t xml:space="preserve"> </w:t>
-      </w:r>
-      <w:proofErr w:type="spellStart"/>
-      <w:r>
-        <w:t>hỗ</w:t>
-      </w:r>
-      <w:proofErr w:type="spellEnd"/>
-      <w:r>
-        <w:t xml:space="preserve"> </w:t>
-      </w:r>
-      <w:proofErr w:type="spellStart"/>
-      <w:r>
-        <w:t>trợ</w:t>
-      </w:r>
-      <w:proofErr w:type="spellEnd"/>
-      <w:r>
-        <w:t xml:space="preserve"> </w:t>
-      </w:r>
-      <w:proofErr w:type="spellStart"/>
-      <w:r>
-        <w:t>quá</w:t>
-      </w:r>
-      <w:proofErr w:type="spellEnd"/>
-      <w:r>
-        <w:t xml:space="preserve"> </w:t>
-      </w:r>
-      <w:proofErr w:type="spellStart"/>
-      <w:r>
-        <w:t>trình</w:t>
-      </w:r>
-      <w:proofErr w:type="spellEnd"/>
-      <w:r>
-        <w:t xml:space="preserve"> </w:t>
-      </w:r>
-      <w:proofErr w:type="spellStart"/>
-      <w:r>
-        <w:t>hoàn</w:t>
-      </w:r>
-      <w:proofErr w:type="spellEnd"/>
-      <w:r>
-        <w:t xml:space="preserve"> </w:t>
-      </w:r>
-      <w:proofErr w:type="spellStart"/>
-      <w:r>
-        <w:t>thành</w:t>
-      </w:r>
-      <w:proofErr w:type="spellEnd"/>
-      <w:r>
-        <w:t xml:space="preserve"> </w:t>
-      </w:r>
-      <w:proofErr w:type="spellStart"/>
-      <w:r>
-        <w:t>công</w:t>
-      </w:r>
-      <w:proofErr w:type="spellEnd"/>
-      <w:r>
-        <w:t xml:space="preserve"> </w:t>
-      </w:r>
-      <w:proofErr w:type="spellStart"/>
-      <w:r>
-        <w:t>việc</w:t>
-      </w:r>
-      <w:proofErr w:type="spellEnd"/>
+      <w:r>
+        <w:t>trình hoàn thành công việc</w:t>
+      </w:r>
     </w:p>
     <w:p/>
     <w:p/>
     <w:p/>
     <w:p/>
     <w:p>
-      <w:proofErr w:type="spellStart"/>
-      <w:r>
-        <w:t>Phần</w:t>
-      </w:r>
-      <w:proofErr w:type="spellEnd"/>
-      <w:r>
-        <w:t xml:space="preserve"> 1.8 </w:t>
-      </w:r>
-      <w:proofErr w:type="spellStart"/>
-      <w:r>
-        <w:t>làm</w:t>
-      </w:r>
-      <w:proofErr w:type="spellEnd"/>
-      <w:r>
-        <w:t xml:space="preserve"> </w:t>
-      </w:r>
-      <w:proofErr w:type="spellStart"/>
-      <w:r>
-        <w:t>thêm</w:t>
-      </w:r>
-      <w:proofErr w:type="spellEnd"/>
-      <w:r>
-        <w:t xml:space="preserve"> 1 </w:t>
-      </w:r>
-      <w:proofErr w:type="spellStart"/>
-      <w:r>
-        <w:t>bảng</w:t>
-      </w:r>
-      <w:proofErr w:type="spellEnd"/>
-      <w:r>
-        <w:t xml:space="preserve"> </w:t>
-      </w:r>
-      <w:proofErr w:type="spellStart"/>
-      <w:r>
-        <w:t>từng</w:t>
-      </w:r>
-      <w:proofErr w:type="spellEnd"/>
-      <w:r>
-        <w:t xml:space="preserve"> </w:t>
-      </w:r>
-      <w:proofErr w:type="spellStart"/>
-      <w:r>
-        <w:t>chức</w:t>
-      </w:r>
-      <w:proofErr w:type="spellEnd"/>
-      <w:r>
-        <w:t xml:space="preserve"> </w:t>
-      </w:r>
-      <w:proofErr w:type="spellStart"/>
-      <w:r>
-        <w:t>năng</w:t>
-      </w:r>
-      <w:proofErr w:type="spellEnd"/>
-      <w:r>
-        <w:t xml:space="preserve"> </w:t>
-      </w:r>
-      <w:proofErr w:type="spellStart"/>
-      <w:r>
-        <w:t>cần</w:t>
-      </w:r>
-      <w:proofErr w:type="spellEnd"/>
-      <w:r>
-        <w:t xml:space="preserve"> </w:t>
-      </w:r>
-      <w:proofErr w:type="spellStart"/>
-      <w:r>
-        <w:t>những</w:t>
-      </w:r>
-      <w:proofErr w:type="spellEnd"/>
-      <w:r>
-        <w:t xml:space="preserve"> rule </w:t>
-      </w:r>
-      <w:proofErr w:type="spellStart"/>
-      <w:r>
-        <w:t>gì</w:t>
-      </w:r>
-      <w:proofErr w:type="spellEnd"/>
-      <w:r>
-        <w:t xml:space="preserve"> , 1 </w:t>
-      </w:r>
-      <w:proofErr w:type="spellStart"/>
-      <w:r>
-        <w:t>bên</w:t>
-      </w:r>
-      <w:proofErr w:type="spellEnd"/>
-      <w:r>
-        <w:t xml:space="preserve"> </w:t>
-      </w:r>
-      <w:proofErr w:type="spellStart"/>
-      <w:r>
-        <w:t>chức</w:t>
-      </w:r>
-      <w:proofErr w:type="spellEnd"/>
-      <w:r>
-        <w:t xml:space="preserve"> </w:t>
-      </w:r>
-      <w:proofErr w:type="spellStart"/>
-      <w:r>
-        <w:t>năng</w:t>
-      </w:r>
-      <w:proofErr w:type="spellEnd"/>
-      <w:r>
-        <w:t xml:space="preserve">, 1 </w:t>
-      </w:r>
-      <w:proofErr w:type="spellStart"/>
-      <w:r>
-        <w:t>bên</w:t>
-      </w:r>
-      <w:proofErr w:type="spellEnd"/>
-      <w:r>
-        <w:t xml:space="preserve"> rule</w:t>
+      <w:r>
+        <w:t>Phần 1.8 làm thêm 1 bảng từng chức năng cần những rule gì , 1 bên chức năng, 1 bên rule</w:t>
       </w:r>
     </w:p>
     <w:p>
@@ -3266,44 +1549,136 @@
       <w:r>
         <w:t xml:space="preserve">BTL: </w:t>
       </w:r>
-      <w:proofErr w:type="spellStart"/>
-      <w:r>
-        <w:t>mỗi</w:t>
-      </w:r>
-      <w:proofErr w:type="spellEnd"/>
-      <w:r>
-        <w:t xml:space="preserve"> </w:t>
-      </w:r>
-      <w:proofErr w:type="spellStart"/>
-      <w:r>
-        <w:t>người</w:t>
-      </w:r>
-      <w:proofErr w:type="spellEnd"/>
-      <w:r>
-        <w:t xml:space="preserve"> 6 </w:t>
-      </w:r>
-      <w:proofErr w:type="spellStart"/>
-      <w:r>
-        <w:t>cái</w:t>
-      </w:r>
-      <w:proofErr w:type="spellEnd"/>
-      <w:r>
-        <w:t xml:space="preserve"> prototype </w:t>
-      </w:r>
-      <w:proofErr w:type="spellStart"/>
-      <w:r>
-        <w:t>trong</w:t>
-      </w:r>
-      <w:proofErr w:type="spellEnd"/>
-      <w:r>
-        <w:t xml:space="preserve"> </w:t>
-      </w:r>
-      <w:proofErr w:type="spellStart"/>
-      <w:r>
-        <w:t>figma</w:t>
-      </w:r>
-      <w:proofErr w:type="spellEnd"/>
-    </w:p>
+      <w:r>
+        <w:t>mỗi người 6 cái prototype trong figma</w:t>
+      </w:r>
+    </w:p>
+    <w:p>
+      <w:r>
+        <w:t>Đặc tả yc phi chức năng ch14</w:t>
+      </w:r>
+    </w:p>
+    <w:p>
+      <w:r>
+        <w:t>Prototype ch15</w:t>
+      </w:r>
+    </w:p>
+    <w:p/>
+    <w:p>
+      <w:r>
+        <w:rPr>
+          <w:rFonts w:ascii="Segoe UI Emoji" w:hAnsi="Segoe UI Emoji" w:cs="Segoe UI Emoji"/>
+        </w:rPr>
+        <w:t>✅</w:t>
+      </w:r>
+      <w:r>
+        <w:t xml:space="preserve"> Ví dụ </w:t>
+      </w:r>
+      <w:r>
+        <w:t>1</w:t>
+      </w:r>
+      <w:r>
+        <w:t xml:space="preserve">: Khả dụng (Usability) </w:t>
+      </w:r>
+    </w:p>
+    <w:p>
+      <w:r>
+        <w:t>Yêu cầu: Người dùng mới có thể hoàn tất quy trình đặt món đầu tiên (từ chọn món đến thanh toán) trong ≤ 3 phút với tỷ lệ thành công ≥ 90%, sau tối đa 5 phút làm quen với hệ thống.</w:t>
+      </w:r>
+    </w:p>
+    <w:p/>
+    <w:p>
+      <w:r>
+        <w:rPr>
+          <w:rFonts w:ascii="Segoe UI Emoji" w:hAnsi="Segoe UI Emoji" w:cs="Segoe UI Emoji"/>
+        </w:rPr>
+        <w:t>✅</w:t>
+      </w:r>
+      <w:r>
+        <w:t xml:space="preserve"> V</w:t>
+      </w:r>
+      <w:r>
+        <w:rPr>
+          <w:rFonts w:cs="Times New Roman"/>
+        </w:rPr>
+        <w:t>í</w:t>
+      </w:r>
+      <w:r>
+        <w:t xml:space="preserve"> dụ 2: Thời gian giao hàng (Reliability / Service Quality) </w:t>
+      </w:r>
+    </w:p>
+    <w:p>
+      <w:r>
+        <w:t xml:space="preserve">Yêu cầu: Hệ thống phải đảm bảo 90% đơn hàng được giao thành công trong vòng ≤ 45 phút kể từ khi xác nhận đơn, áp dụng trong giờ cao điểm (11h–13h, 18h–20h) </w:t>
+      </w:r>
+    </w:p>
+    <w:p/>
+    <w:p/>
+    <w:p/>
+    <w:p>
+      <w:r>
+        <w:t>Hai yêu cầu này có trade-off vì:</w:t>
+      </w:r>
+    </w:p>
+    <w:p>
+      <w:pPr>
+        <w:numPr>
+          <w:ilvl w:val="0"/>
+          <w:numId w:val="7"/>
+        </w:numPr>
+      </w:pPr>
+      <w:r>
+        <w:rPr>
+          <w:b/>
+          <w:bCs/>
+        </w:rPr>
+        <w:t>Usability</w:t>
+      </w:r>
+      <w:r>
+        <w:rPr>
+          <w:b/>
+          <w:bCs/>
+        </w:rPr>
+        <w:t>(Tính khả dụng)</w:t>
+      </w:r>
+      <w:r>
+        <w:t xml:space="preserve"> tối ưu tốc độ và sự đơn giản cho người dùng </w:t>
+      </w:r>
+    </w:p>
+    <w:p>
+      <w:pPr>
+        <w:numPr>
+          <w:ilvl w:val="0"/>
+          <w:numId w:val="7"/>
+        </w:numPr>
+      </w:pPr>
+      <w:r>
+        <w:rPr>
+          <w:b/>
+          <w:bCs/>
+        </w:rPr>
+        <w:t>Reliability</w:t>
+      </w:r>
+      <w:r>
+        <w:rPr>
+          <w:b/>
+          <w:bCs/>
+        </w:rPr>
+        <w:t>(Tính tin cậy)</w:t>
+      </w:r>
+      <w:r>
+        <w:t xml:space="preserve"> yêu cầu kiểm soát và xác nhận chặt chẽ</w:t>
+      </w:r>
+      <w:r>
+        <w:br/>
+      </w:r>
+    </w:p>
+    <w:p>
+      <w:r>
+        <w:t>→ Việc tăng mức độ kiểm tra để đảm bảo giao hàng đúng hạn có thể làm giảm tốc độ và sự tiện lợi khi đặt món.</w:t>
+      </w:r>
+    </w:p>
+    <w:p/>
     <w:sectPr>
       <w:pgSz w:w="12240" w:h="15840"/>
       <w:pgMar w:top="1134" w:right="851" w:bottom="1134" w:left="1701" w:header="720" w:footer="720" w:gutter="0"/>
@@ -3893,6 +2268,155 @@
     </w:lvl>
   </w:abstractNum>
   <w:abstractNum w:abstractNumId="5" w15:restartNumberingAfterBreak="0">
+    <w:nsid w:val="72D523C0"/>
+    <w:multiLevelType w:val="multilevel"/>
+    <w:tmpl w:val="8AEE706E"/>
+    <w:lvl w:ilvl="0">
+      <w:start w:val="1"/>
+      <w:numFmt w:val="bullet"/>
+      <w:lvlText w:val=""/>
+      <w:lvlJc w:val="left"/>
+      <w:pPr>
+        <w:tabs>
+          <w:tab w:val="num" w:pos="720"/>
+        </w:tabs>
+        <w:ind w:left="720" w:hanging="360"/>
+      </w:pPr>
+      <w:rPr>
+        <w:rFonts w:ascii="Symbol" w:hAnsi="Symbol" w:hint="default"/>
+        <w:sz w:val="20"/>
+      </w:rPr>
+    </w:lvl>
+    <w:lvl w:ilvl="1" w:tentative="1">
+      <w:start w:val="1"/>
+      <w:numFmt w:val="bullet"/>
+      <w:lvlText w:val="o"/>
+      <w:lvlJc w:val="left"/>
+      <w:pPr>
+        <w:tabs>
+          <w:tab w:val="num" w:pos="1440"/>
+        </w:tabs>
+        <w:ind w:left="1440" w:hanging="360"/>
+      </w:pPr>
+      <w:rPr>
+        <w:rFonts w:ascii="Courier New" w:hAnsi="Courier New" w:hint="default"/>
+        <w:sz w:val="20"/>
+      </w:rPr>
+    </w:lvl>
+    <w:lvl w:ilvl="2" w:tentative="1">
+      <w:start w:val="1"/>
+      <w:numFmt w:val="bullet"/>
+      <w:lvlText w:val=""/>
+      <w:lvlJc w:val="left"/>
+      <w:pPr>
+        <w:tabs>
+          <w:tab w:val="num" w:pos="2160"/>
+        </w:tabs>
+        <w:ind w:left="2160" w:hanging="360"/>
+      </w:pPr>
+      <w:rPr>
+        <w:rFonts w:ascii="Wingdings" w:hAnsi="Wingdings" w:hint="default"/>
+        <w:sz w:val="20"/>
+      </w:rPr>
+    </w:lvl>
+    <w:lvl w:ilvl="3" w:tentative="1">
+      <w:start w:val="1"/>
+      <w:numFmt w:val="bullet"/>
+      <w:lvlText w:val=""/>
+      <w:lvlJc w:val="left"/>
+      <w:pPr>
+        <w:tabs>
+          <w:tab w:val="num" w:pos="2880"/>
+        </w:tabs>
+        <w:ind w:left="2880" w:hanging="360"/>
+      </w:pPr>
+      <w:rPr>
+        <w:rFonts w:ascii="Wingdings" w:hAnsi="Wingdings" w:hint="default"/>
+        <w:sz w:val="20"/>
+      </w:rPr>
+    </w:lvl>
+    <w:lvl w:ilvl="4" w:tentative="1">
+      <w:start w:val="1"/>
+      <w:numFmt w:val="bullet"/>
+      <w:lvlText w:val=""/>
+      <w:lvlJc w:val="left"/>
+      <w:pPr>
+        <w:tabs>
+          <w:tab w:val="num" w:pos="3600"/>
+        </w:tabs>
+        <w:ind w:left="3600" w:hanging="360"/>
+      </w:pPr>
+      <w:rPr>
+        <w:rFonts w:ascii="Wingdings" w:hAnsi="Wingdings" w:hint="default"/>
+        <w:sz w:val="20"/>
+      </w:rPr>
+    </w:lvl>
+    <w:lvl w:ilvl="5" w:tentative="1">
+      <w:start w:val="1"/>
+      <w:numFmt w:val="bullet"/>
+      <w:lvlText w:val=""/>
+      <w:lvlJc w:val="left"/>
+      <w:pPr>
+        <w:tabs>
+          <w:tab w:val="num" w:pos="4320"/>
+        </w:tabs>
+        <w:ind w:left="4320" w:hanging="360"/>
+      </w:pPr>
+      <w:rPr>
+        <w:rFonts w:ascii="Wingdings" w:hAnsi="Wingdings" w:hint="default"/>
+        <w:sz w:val="20"/>
+      </w:rPr>
+    </w:lvl>
+    <w:lvl w:ilvl="6" w:tentative="1">
+      <w:start w:val="1"/>
+      <w:numFmt w:val="bullet"/>
+      <w:lvlText w:val=""/>
+      <w:lvlJc w:val="left"/>
+      <w:pPr>
+        <w:tabs>
+          <w:tab w:val="num" w:pos="5040"/>
+        </w:tabs>
+        <w:ind w:left="5040" w:hanging="360"/>
+      </w:pPr>
+      <w:rPr>
+        <w:rFonts w:ascii="Wingdings" w:hAnsi="Wingdings" w:hint="default"/>
+        <w:sz w:val="20"/>
+      </w:rPr>
+    </w:lvl>
+    <w:lvl w:ilvl="7" w:tentative="1">
+      <w:start w:val="1"/>
+      <w:numFmt w:val="bullet"/>
+      <w:lvlText w:val=""/>
+      <w:lvlJc w:val="left"/>
+      <w:pPr>
+        <w:tabs>
+          <w:tab w:val="num" w:pos="5760"/>
+        </w:tabs>
+        <w:ind w:left="5760" w:hanging="360"/>
+      </w:pPr>
+      <w:rPr>
+        <w:rFonts w:ascii="Wingdings" w:hAnsi="Wingdings" w:hint="default"/>
+        <w:sz w:val="20"/>
+      </w:rPr>
+    </w:lvl>
+    <w:lvl w:ilvl="8" w:tentative="1">
+      <w:start w:val="1"/>
+      <w:numFmt w:val="bullet"/>
+      <w:lvlText w:val=""/>
+      <w:lvlJc w:val="left"/>
+      <w:pPr>
+        <w:tabs>
+          <w:tab w:val="num" w:pos="6480"/>
+        </w:tabs>
+        <w:ind w:left="6480" w:hanging="360"/>
+      </w:pPr>
+      <w:rPr>
+        <w:rFonts w:ascii="Wingdings" w:hAnsi="Wingdings" w:hint="default"/>
+        <w:sz w:val="20"/>
+      </w:rPr>
+    </w:lvl>
+  </w:abstractNum>
+  <w:abstractNum w:abstractNumId="6" w15:restartNumberingAfterBreak="0">
     <w:nsid w:val="7FEA7591"/>
     <w:multiLevelType w:val="hybridMultilevel"/>
     <w:tmpl w:val="04707FC6"/>
@@ -4006,7 +2530,7 @@
     </w:lvl>
   </w:abstractNum>
   <w:num w:numId="1" w16cid:durableId="1413429568">
-    <w:abstractNumId w:val="5"/>
+    <w:abstractNumId w:val="6"/>
   </w:num>
   <w:num w:numId="2" w16cid:durableId="551309405">
     <w:abstractNumId w:val="2"/>
@@ -4022,6 +2546,9 @@
   </w:num>
   <w:num w:numId="6" w16cid:durableId="1593052585">
     <w:abstractNumId w:val="0"/>
+  </w:num>
+  <w:num w:numId="7" w16cid:durableId="1309163813">
+    <w:abstractNumId w:val="5"/>
   </w:num>
 </w:numbering>
 </file>
@@ -4628,7 +3155,6 @@
   <w:style w:type="character" w:default="1" w:styleId="DefaultParagraphFont">
     <w:name w:val="Default Paragraph Font"/>
     <w:uiPriority w:val="1"/>
-    <w:semiHidden/>
     <w:unhideWhenUsed/>
   </w:style>
   <w:style w:type="table" w:default="1" w:styleId="TableNormal">

</xml_diff>